<commit_message>
esta revision de docx y pdf fue enviada por whatsapp a los tutores
</commit_message>
<xml_diff>
--- a/docs/especializacion/Memoria/Memoria_EITI_Llanes.docx
+++ b/docs/especializacion/Memoria/Memoria_EITI_Llanes.docx
@@ -84,7 +84,7 @@
           <w:noProof/>
         </w:rPr>
         <w:drawing>
-          <wp:anchor distT="0" distB="0" distL="114300" distR="114300" simplePos="0" relativeHeight="251656192" behindDoc="0" locked="0" layoutInCell="1" allowOverlap="1" wp14:anchorId="352FC000" wp14:editId="1B4F0875">
+          <wp:anchor distT="0" distB="0" distL="114300" distR="114300" simplePos="0" relativeHeight="251657216" behindDoc="0" locked="0" layoutInCell="1" allowOverlap="1" wp14:anchorId="352FC000" wp14:editId="1B4F0875">
             <wp:simplePos x="0" y="0"/>
             <wp:positionH relativeFrom="column">
               <wp:posOffset>-579037</wp:posOffset>
@@ -430,7 +430,7 @@
       <w:r>
         <w:fldChar w:fldCharType="separate"/>
       </w:r>
-      <w:hyperlink w:anchor="_Toc242435353" w:history="1">
+      <w:hyperlink w:anchor="_Toc242435951" w:history="1">
         <w:r>
           <w:rPr>
             <w:rStyle w:val="Hyperlink"/>
@@ -458,7 +458,7 @@
             <w:noProof/>
             <w:webHidden/>
           </w:rPr>
-          <w:instrText xml:space="preserve"> PAGEREF _Toc242435353 \h </w:instrText>
+          <w:instrText xml:space="preserve"> PAGEREF _Toc242435951 \h </w:instrText>
         </w:r>
         <w:r>
           <w:rPr>
@@ -504,7 +504,7 @@
           <w14:ligatures w14:val="standardContextual"/>
         </w:rPr>
       </w:pPr>
-      <w:hyperlink w:anchor="_Toc242435354" w:history="1">
+      <w:hyperlink w:anchor="_Toc242435952" w:history="1">
         <w:r>
           <w:rPr>
             <w:rStyle w:val="Hyperlink"/>
@@ -532,7 +532,7 @@
             <w:noProof/>
             <w:webHidden/>
           </w:rPr>
-          <w:instrText xml:space="preserve"> PAGEREF _Toc242435354 \h </w:instrText>
+          <w:instrText xml:space="preserve"> PAGEREF _Toc242435952 \h </w:instrText>
         </w:r>
         <w:r>
           <w:rPr>
@@ -578,7 +578,7 @@
           <w14:ligatures w14:val="standardContextual"/>
         </w:rPr>
       </w:pPr>
-      <w:hyperlink w:anchor="_Toc242435355" w:history="1">
+      <w:hyperlink w:anchor="_Toc242435953" w:history="1">
         <w:r>
           <w:rPr>
             <w:rStyle w:val="Hyperlink"/>
@@ -606,7 +606,7 @@
             <w:noProof/>
             <w:webHidden/>
           </w:rPr>
-          <w:instrText xml:space="preserve"> PAGEREF _Toc242435355 \h </w:instrText>
+          <w:instrText xml:space="preserve"> PAGEREF _Toc242435953 \h </w:instrText>
         </w:r>
         <w:r>
           <w:rPr>
@@ -652,7 +652,7 @@
           <w14:ligatures w14:val="standardContextual"/>
         </w:rPr>
       </w:pPr>
-      <w:hyperlink w:anchor="_Toc242435356" w:history="1">
+      <w:hyperlink w:anchor="_Toc242435954" w:history="1">
         <w:r>
           <w:rPr>
             <w:rStyle w:val="Hyperlink"/>
@@ -680,7 +680,7 @@
             <w:noProof/>
             <w:webHidden/>
           </w:rPr>
-          <w:instrText xml:space="preserve"> PAGEREF _Toc242435356 \h </w:instrText>
+          <w:instrText xml:space="preserve"> PAGEREF _Toc242435954 \h </w:instrText>
         </w:r>
         <w:r>
           <w:rPr>
@@ -726,7 +726,7 @@
           <w14:ligatures w14:val="standardContextual"/>
         </w:rPr>
       </w:pPr>
-      <w:hyperlink w:anchor="_Toc242435357" w:history="1">
+      <w:hyperlink w:anchor="_Toc242435955" w:history="1">
         <w:r>
           <w:rPr>
             <w:rStyle w:val="Hyperlink"/>
@@ -754,7 +754,7 @@
             <w:noProof/>
             <w:webHidden/>
           </w:rPr>
-          <w:instrText xml:space="preserve"> PAGEREF _Toc242435357 \h </w:instrText>
+          <w:instrText xml:space="preserve"> PAGEREF _Toc242435955 \h </w:instrText>
         </w:r>
         <w:r>
           <w:rPr>
@@ -800,7 +800,7 @@
           <w14:ligatures w14:val="standardContextual"/>
         </w:rPr>
       </w:pPr>
-      <w:hyperlink w:anchor="_Toc242435358" w:history="1">
+      <w:hyperlink w:anchor="_Toc242435956" w:history="1">
         <w:r>
           <w:rPr>
             <w:rStyle w:val="Hyperlink"/>
@@ -828,7 +828,7 @@
             <w:noProof/>
             <w:webHidden/>
           </w:rPr>
-          <w:instrText xml:space="preserve"> PAGEREF _Toc242435358 \h </w:instrText>
+          <w:instrText xml:space="preserve"> PAGEREF _Toc242435956 \h </w:instrText>
         </w:r>
         <w:r>
           <w:rPr>
@@ -874,7 +874,7 @@
           <w14:ligatures w14:val="standardContextual"/>
         </w:rPr>
       </w:pPr>
-      <w:hyperlink w:anchor="_Toc242435359" w:history="1">
+      <w:hyperlink w:anchor="_Toc242435957" w:history="1">
         <w:r>
           <w:rPr>
             <w:rStyle w:val="Hyperlink"/>
@@ -902,7 +902,7 @@
             <w:noProof/>
             <w:webHidden/>
           </w:rPr>
-          <w:instrText xml:space="preserve"> PAGEREF _Toc242435359 \h </w:instrText>
+          <w:instrText xml:space="preserve"> PAGEREF _Toc242435957 \h </w:instrText>
         </w:r>
         <w:r>
           <w:rPr>
@@ -948,7 +948,7 @@
           <w14:ligatures w14:val="standardContextual"/>
         </w:rPr>
       </w:pPr>
-      <w:hyperlink w:anchor="_Toc242435360" w:history="1">
+      <w:hyperlink w:anchor="_Toc242435958" w:history="1">
         <w:r>
           <w:rPr>
             <w:rStyle w:val="Hyperlink"/>
@@ -976,7 +976,7 @@
             <w:noProof/>
             <w:webHidden/>
           </w:rPr>
-          <w:instrText xml:space="preserve"> PAGEREF _Toc242435360 \h </w:instrText>
+          <w:instrText xml:space="preserve"> PAGEREF _Toc242435958 \h </w:instrText>
         </w:r>
         <w:r>
           <w:rPr>
@@ -1022,7 +1022,7 @@
           <w14:ligatures w14:val="standardContextual"/>
         </w:rPr>
       </w:pPr>
-      <w:hyperlink w:anchor="_Toc242435361" w:history="1">
+      <w:hyperlink w:anchor="_Toc242435959" w:history="1">
         <w:r>
           <w:rPr>
             <w:rStyle w:val="Hyperlink"/>
@@ -1050,7 +1050,7 @@
             <w:noProof/>
             <w:webHidden/>
           </w:rPr>
-          <w:instrText xml:space="preserve"> PAGEREF _Toc242435361 \h </w:instrText>
+          <w:instrText xml:space="preserve"> PAGEREF _Toc242435959 \h </w:instrText>
         </w:r>
         <w:r>
           <w:rPr>
@@ -1096,7 +1096,7 @@
           <w14:ligatures w14:val="standardContextual"/>
         </w:rPr>
       </w:pPr>
-      <w:hyperlink w:anchor="_Toc242435362" w:history="1">
+      <w:hyperlink w:anchor="_Toc242435960" w:history="1">
         <w:r>
           <w:rPr>
             <w:rStyle w:val="Hyperlink"/>
@@ -1124,7 +1124,7 @@
             <w:noProof/>
             <w:webHidden/>
           </w:rPr>
-          <w:instrText xml:space="preserve"> PAGEREF _Toc242435362 \h </w:instrText>
+          <w:instrText xml:space="preserve"> PAGEREF _Toc242435960 \h </w:instrText>
         </w:r>
         <w:r>
           <w:rPr>
@@ -1170,7 +1170,7 @@
           <w14:ligatures w14:val="standardContextual"/>
         </w:rPr>
       </w:pPr>
-      <w:hyperlink w:anchor="_Toc242435363" w:history="1">
+      <w:hyperlink w:anchor="_Toc242435961" w:history="1">
         <w:r>
           <w:rPr>
             <w:rStyle w:val="Hyperlink"/>
@@ -1198,7 +1198,7 @@
             <w:noProof/>
             <w:webHidden/>
           </w:rPr>
-          <w:instrText xml:space="preserve"> PAGEREF _Toc242435363 \h </w:instrText>
+          <w:instrText xml:space="preserve"> PAGEREF _Toc242435961 \h </w:instrText>
         </w:r>
         <w:r>
           <w:rPr>
@@ -1244,7 +1244,7 @@
           <w14:ligatures w14:val="standardContextual"/>
         </w:rPr>
       </w:pPr>
-      <w:hyperlink w:anchor="_Toc242435364" w:history="1">
+      <w:hyperlink w:anchor="_Toc242435962" w:history="1">
         <w:r>
           <w:rPr>
             <w:rStyle w:val="Hyperlink"/>
@@ -1272,7 +1272,7 @@
             <w:noProof/>
             <w:webHidden/>
           </w:rPr>
-          <w:instrText xml:space="preserve"> PAGEREF _Toc242435364 \h </w:instrText>
+          <w:instrText xml:space="preserve"> PAGEREF _Toc242435962 \h </w:instrText>
         </w:r>
         <w:r>
           <w:rPr>
@@ -1318,7 +1318,7 @@
           <w14:ligatures w14:val="standardContextual"/>
         </w:rPr>
       </w:pPr>
-      <w:hyperlink w:anchor="_Toc242435365" w:history="1">
+      <w:hyperlink w:anchor="_Toc242435963" w:history="1">
         <w:r>
           <w:rPr>
             <w:rStyle w:val="Hyperlink"/>
@@ -1346,7 +1346,7 @@
             <w:noProof/>
             <w:webHidden/>
           </w:rPr>
-          <w:instrText xml:space="preserve"> PAGEREF _Toc242435365 \h </w:instrText>
+          <w:instrText xml:space="preserve"> PAGEREF _Toc242435963 \h </w:instrText>
         </w:r>
         <w:r>
           <w:rPr>
@@ -1392,7 +1392,7 @@
           <w14:ligatures w14:val="standardContextual"/>
         </w:rPr>
       </w:pPr>
-      <w:hyperlink w:anchor="_Toc242435366" w:history="1">
+      <w:hyperlink w:anchor="_Toc242435964" w:history="1">
         <w:r>
           <w:rPr>
             <w:rStyle w:val="Hyperlink"/>
@@ -1420,7 +1420,7 @@
             <w:noProof/>
             <w:webHidden/>
           </w:rPr>
-          <w:instrText xml:space="preserve"> PAGEREF _Toc242435366 \h </w:instrText>
+          <w:instrText xml:space="preserve"> PAGEREF _Toc242435964 \h </w:instrText>
         </w:r>
         <w:r>
           <w:rPr>
@@ -1466,7 +1466,7 @@
           <w14:ligatures w14:val="standardContextual"/>
         </w:rPr>
       </w:pPr>
-      <w:hyperlink w:anchor="_Toc242435367" w:history="1">
+      <w:hyperlink w:anchor="_Toc242435965" w:history="1">
         <w:r>
           <w:rPr>
             <w:rStyle w:val="Hyperlink"/>
@@ -1494,7 +1494,7 @@
             <w:noProof/>
             <w:webHidden/>
           </w:rPr>
-          <w:instrText xml:space="preserve"> PAGEREF _Toc242435367 \h </w:instrText>
+          <w:instrText xml:space="preserve"> PAGEREF _Toc242435965 \h </w:instrText>
         </w:r>
         <w:r>
           <w:rPr>
@@ -1540,7 +1540,7 @@
           <w14:ligatures w14:val="standardContextual"/>
         </w:rPr>
       </w:pPr>
-      <w:hyperlink w:anchor="_Toc242435368" w:history="1">
+      <w:hyperlink w:anchor="_Toc242435966" w:history="1">
         <w:r>
           <w:rPr>
             <w:rStyle w:val="Hyperlink"/>
@@ -1568,7 +1568,7 @@
             <w:noProof/>
             <w:webHidden/>
           </w:rPr>
-          <w:instrText xml:space="preserve"> PAGEREF _Toc242435368 \h </w:instrText>
+          <w:instrText xml:space="preserve"> PAGEREF _Toc242435966 \h </w:instrText>
         </w:r>
         <w:r>
           <w:rPr>
@@ -1614,7 +1614,7 @@
           <w14:ligatures w14:val="standardContextual"/>
         </w:rPr>
       </w:pPr>
-      <w:hyperlink w:anchor="_Toc242435369" w:history="1">
+      <w:hyperlink w:anchor="_Toc242435967" w:history="1">
         <w:r>
           <w:rPr>
             <w:rStyle w:val="Hyperlink"/>
@@ -1642,7 +1642,7 @@
             <w:noProof/>
             <w:webHidden/>
           </w:rPr>
-          <w:instrText xml:space="preserve"> PAGEREF _Toc242435369 \h </w:instrText>
+          <w:instrText xml:space="preserve"> PAGEREF _Toc242435967 \h </w:instrText>
         </w:r>
         <w:r>
           <w:rPr>
@@ -1688,7 +1688,7 @@
           <w14:ligatures w14:val="standardContextual"/>
         </w:rPr>
       </w:pPr>
-      <w:hyperlink w:anchor="_Toc242435370" w:history="1">
+      <w:hyperlink w:anchor="_Toc242435968" w:history="1">
         <w:r>
           <w:rPr>
             <w:rStyle w:val="Hyperlink"/>
@@ -1716,7 +1716,7 @@
             <w:noProof/>
             <w:webHidden/>
           </w:rPr>
-          <w:instrText xml:space="preserve"> PAGEREF _Toc242435370 \h </w:instrText>
+          <w:instrText xml:space="preserve"> PAGEREF _Toc242435968 \h </w:instrText>
         </w:r>
         <w:r>
           <w:rPr>
@@ -1762,7 +1762,7 @@
           <w14:ligatures w14:val="standardContextual"/>
         </w:rPr>
       </w:pPr>
-      <w:hyperlink w:anchor="_Toc242435371" w:history="1">
+      <w:hyperlink w:anchor="_Toc242435969" w:history="1">
         <w:r>
           <w:rPr>
             <w:rStyle w:val="Hyperlink"/>
@@ -1789,7 +1789,7 @@
             <w:noProof/>
             <w:webHidden/>
           </w:rPr>
-          <w:instrText xml:space="preserve"> PAGEREF _Toc242435371 \h </w:instrText>
+          <w:instrText xml:space="preserve"> PAGEREF _Toc242435969 \h </w:instrText>
         </w:r>
         <w:r>
           <w:rPr>
@@ -1835,7 +1835,7 @@
           <w14:ligatures w14:val="standardContextual"/>
         </w:rPr>
       </w:pPr>
-      <w:hyperlink w:anchor="_Toc242435372" w:history="1">
+      <w:hyperlink w:anchor="_Toc242435970" w:history="1">
         <w:r>
           <w:rPr>
             <w:rStyle w:val="Hyperlink"/>
@@ -1863,7 +1863,7 @@
             <w:noProof/>
             <w:webHidden/>
           </w:rPr>
-          <w:instrText xml:space="preserve"> PAGEREF _Toc242435372 \h </w:instrText>
+          <w:instrText xml:space="preserve"> PAGEREF _Toc242435970 \h </w:instrText>
         </w:r>
         <w:r>
           <w:rPr>
@@ -1909,7 +1909,7 @@
           <w14:ligatures w14:val="standardContextual"/>
         </w:rPr>
       </w:pPr>
-      <w:hyperlink w:anchor="_Toc242435373" w:history="1">
+      <w:hyperlink w:anchor="_Toc242435971" w:history="1">
         <w:r>
           <w:rPr>
             <w:rStyle w:val="Hyperlink"/>
@@ -1937,7 +1937,7 @@
             <w:noProof/>
             <w:webHidden/>
           </w:rPr>
-          <w:instrText xml:space="preserve"> PAGEREF _Toc242435373 \h </w:instrText>
+          <w:instrText xml:space="preserve"> PAGEREF _Toc242435971 \h </w:instrText>
         </w:r>
         <w:r>
           <w:rPr>
@@ -1983,7 +1983,7 @@
           <w14:ligatures w14:val="standardContextual"/>
         </w:rPr>
       </w:pPr>
-      <w:hyperlink w:anchor="_Toc242435374" w:history="1">
+      <w:hyperlink w:anchor="_Toc242435972" w:history="1">
         <w:r>
           <w:rPr>
             <w:rStyle w:val="Hyperlink"/>
@@ -2011,7 +2011,7 @@
             <w:noProof/>
             <w:webHidden/>
           </w:rPr>
-          <w:instrText xml:space="preserve"> PAGEREF _Toc242435374 \h </w:instrText>
+          <w:instrText xml:space="preserve"> PAGEREF _Toc242435972 \h </w:instrText>
         </w:r>
         <w:r>
           <w:rPr>
@@ -2057,7 +2057,7 @@
           <w14:ligatures w14:val="standardContextual"/>
         </w:rPr>
       </w:pPr>
-      <w:hyperlink w:anchor="_Toc242435375" w:history="1">
+      <w:hyperlink w:anchor="_Toc242435973" w:history="1">
         <w:r>
           <w:rPr>
             <w:rStyle w:val="Hyperlink"/>
@@ -2085,7 +2085,7 @@
             <w:noProof/>
             <w:webHidden/>
           </w:rPr>
-          <w:instrText xml:space="preserve"> PAGEREF _Toc242435375 \h </w:instrText>
+          <w:instrText xml:space="preserve"> PAGEREF _Toc242435973 \h </w:instrText>
         </w:r>
         <w:r>
           <w:rPr>
@@ -2131,7 +2131,7 @@
           <w14:ligatures w14:val="standardContextual"/>
         </w:rPr>
       </w:pPr>
-      <w:hyperlink w:anchor="_Toc242435376" w:history="1">
+      <w:hyperlink w:anchor="_Toc242435974" w:history="1">
         <w:r>
           <w:rPr>
             <w:rStyle w:val="Hyperlink"/>
@@ -2158,7 +2158,7 @@
             <w:noProof/>
             <w:webHidden/>
           </w:rPr>
-          <w:instrText xml:space="preserve"> PAGEREF _Toc242435376 \h </w:instrText>
+          <w:instrText xml:space="preserve"> PAGEREF _Toc242435974 \h </w:instrText>
         </w:r>
         <w:r>
           <w:rPr>
@@ -2204,7 +2204,7 @@
           <w14:ligatures w14:val="standardContextual"/>
         </w:rPr>
       </w:pPr>
-      <w:hyperlink w:anchor="_Toc242435377" w:history="1">
+      <w:hyperlink w:anchor="_Toc242435975" w:history="1">
         <w:r>
           <w:rPr>
             <w:rStyle w:val="Hyperlink"/>
@@ -2231,7 +2231,7 @@
             <w:noProof/>
             <w:webHidden/>
           </w:rPr>
-          <w:instrText xml:space="preserve"> PAGEREF _Toc242435377 \h </w:instrText>
+          <w:instrText xml:space="preserve"> PAGEREF _Toc242435975 \h </w:instrText>
         </w:r>
         <w:r>
           <w:rPr>
@@ -2277,7 +2277,7 @@
           <w14:ligatures w14:val="standardContextual"/>
         </w:rPr>
       </w:pPr>
-      <w:hyperlink w:anchor="_Toc242435378" w:history="1">
+      <w:hyperlink w:anchor="_Toc242435976" w:history="1">
         <w:r>
           <w:rPr>
             <w:rStyle w:val="Hyperlink"/>
@@ -2305,7 +2305,7 @@
             <w:noProof/>
             <w:webHidden/>
           </w:rPr>
-          <w:instrText xml:space="preserve"> PAGEREF _Toc242435378 \h </w:instrText>
+          <w:instrText xml:space="preserve"> PAGEREF _Toc242435976 \h </w:instrText>
         </w:r>
         <w:r>
           <w:rPr>
@@ -2351,7 +2351,7 @@
           <w14:ligatures w14:val="standardContextual"/>
         </w:rPr>
       </w:pPr>
-      <w:hyperlink w:anchor="_Toc242435379" w:history="1">
+      <w:hyperlink w:anchor="_Toc242435977" w:history="1">
         <w:r>
           <w:rPr>
             <w:rStyle w:val="Hyperlink"/>
@@ -2379,7 +2379,7 @@
             <w:noProof/>
             <w:webHidden/>
           </w:rPr>
-          <w:instrText xml:space="preserve"> PAGEREF _Toc242435379 \h </w:instrText>
+          <w:instrText xml:space="preserve"> PAGEREF _Toc242435977 \h </w:instrText>
         </w:r>
         <w:r>
           <w:rPr>
@@ -2425,7 +2425,7 @@
           <w14:ligatures w14:val="standardContextual"/>
         </w:rPr>
       </w:pPr>
-      <w:hyperlink w:anchor="_Toc242435380" w:history="1">
+      <w:hyperlink w:anchor="_Toc242435978" w:history="1">
         <w:r>
           <w:rPr>
             <w:rStyle w:val="Hyperlink"/>
@@ -2453,7 +2453,7 @@
             <w:noProof/>
             <w:webHidden/>
           </w:rPr>
-          <w:instrText xml:space="preserve"> PAGEREF _Toc242435380 \h </w:instrText>
+          <w:instrText xml:space="preserve"> PAGEREF _Toc242435978 \h </w:instrText>
         </w:r>
         <w:r>
           <w:rPr>
@@ -2499,7 +2499,7 @@
           <w14:ligatures w14:val="standardContextual"/>
         </w:rPr>
       </w:pPr>
-      <w:hyperlink w:anchor="_Toc242435381" w:history="1">
+      <w:hyperlink w:anchor="_Toc242435979" w:history="1">
         <w:r>
           <w:rPr>
             <w:rStyle w:val="Hyperlink"/>
@@ -2527,7 +2527,7 @@
             <w:noProof/>
             <w:webHidden/>
           </w:rPr>
-          <w:instrText xml:space="preserve"> PAGEREF _Toc242435381 \h </w:instrText>
+          <w:instrText xml:space="preserve"> PAGEREF _Toc242435979 \h </w:instrText>
         </w:r>
         <w:r>
           <w:rPr>
@@ -2573,7 +2573,7 @@
           <w14:ligatures w14:val="standardContextual"/>
         </w:rPr>
       </w:pPr>
-      <w:hyperlink w:anchor="_Toc242435382" w:history="1">
+      <w:hyperlink w:anchor="_Toc242435980" w:history="1">
         <w:r>
           <w:rPr>
             <w:rStyle w:val="Hyperlink"/>
@@ -2601,7 +2601,7 @@
             <w:noProof/>
             <w:webHidden/>
           </w:rPr>
-          <w:instrText xml:space="preserve"> PAGEREF _Toc242435382 \h </w:instrText>
+          <w:instrText xml:space="preserve"> PAGEREF _Toc242435980 \h </w:instrText>
         </w:r>
         <w:r>
           <w:rPr>
@@ -2647,7 +2647,7 @@
           <w14:ligatures w14:val="standardContextual"/>
         </w:rPr>
       </w:pPr>
-      <w:hyperlink w:anchor="_Toc242435383" w:history="1">
+      <w:hyperlink w:anchor="_Toc242435981" w:history="1">
         <w:r>
           <w:rPr>
             <w:rStyle w:val="Hyperlink"/>
@@ -2675,7 +2675,7 @@
             <w:noProof/>
             <w:webHidden/>
           </w:rPr>
-          <w:instrText xml:space="preserve"> PAGEREF _Toc242435383 \h </w:instrText>
+          <w:instrText xml:space="preserve"> PAGEREF _Toc242435981 \h </w:instrText>
         </w:r>
         <w:r>
           <w:rPr>
@@ -2721,7 +2721,7 @@
           <w14:ligatures w14:val="standardContextual"/>
         </w:rPr>
       </w:pPr>
-      <w:hyperlink w:anchor="_Toc242435384" w:history="1">
+      <w:hyperlink w:anchor="_Toc242435982" w:history="1">
         <w:r>
           <w:rPr>
             <w:rStyle w:val="Hyperlink"/>
@@ -2749,7 +2749,7 @@
             <w:noProof/>
             <w:webHidden/>
           </w:rPr>
-          <w:instrText xml:space="preserve"> PAGEREF _Toc242435384 \h </w:instrText>
+          <w:instrText xml:space="preserve"> PAGEREF _Toc242435982 \h </w:instrText>
         </w:r>
         <w:r>
           <w:rPr>
@@ -2795,7 +2795,7 @@
           <w14:ligatures w14:val="standardContextual"/>
         </w:rPr>
       </w:pPr>
-      <w:hyperlink w:anchor="_Toc242435385" w:history="1">
+      <w:hyperlink w:anchor="_Toc242435983" w:history="1">
         <w:r>
           <w:rPr>
             <w:rStyle w:val="Hyperlink"/>
@@ -2823,7 +2823,7 @@
             <w:noProof/>
             <w:webHidden/>
           </w:rPr>
-          <w:instrText xml:space="preserve"> PAGEREF _Toc242435385 \h </w:instrText>
+          <w:instrText xml:space="preserve"> PAGEREF _Toc242435983 \h </w:instrText>
         </w:r>
         <w:r>
           <w:rPr>
@@ -2869,7 +2869,7 @@
           <w14:ligatures w14:val="standardContextual"/>
         </w:rPr>
       </w:pPr>
-      <w:hyperlink w:anchor="_Toc242435386" w:history="1">
+      <w:hyperlink w:anchor="_Toc242435984" w:history="1">
         <w:r>
           <w:rPr>
             <w:rStyle w:val="Hyperlink"/>
@@ -2897,7 +2897,7 @@
             <w:noProof/>
             <w:webHidden/>
           </w:rPr>
-          <w:instrText xml:space="preserve"> PAGEREF _Toc242435386 \h </w:instrText>
+          <w:instrText xml:space="preserve"> PAGEREF _Toc242435984 \h </w:instrText>
         </w:r>
         <w:r>
           <w:rPr>
@@ -2943,7 +2943,7 @@
           <w14:ligatures w14:val="standardContextual"/>
         </w:rPr>
       </w:pPr>
-      <w:hyperlink w:anchor="_Toc242435387" w:history="1">
+      <w:hyperlink w:anchor="_Toc242435985" w:history="1">
         <w:r>
           <w:rPr>
             <w:rStyle w:val="Hyperlink"/>
@@ -2971,7 +2971,7 @@
             <w:noProof/>
             <w:webHidden/>
           </w:rPr>
-          <w:instrText xml:space="preserve"> PAGEREF _Toc242435387 \h </w:instrText>
+          <w:instrText xml:space="preserve"> PAGEREF _Toc242435985 \h </w:instrText>
         </w:r>
         <w:r>
           <w:rPr>
@@ -3017,7 +3017,7 @@
           <w14:ligatures w14:val="standardContextual"/>
         </w:rPr>
       </w:pPr>
-      <w:hyperlink w:anchor="_Toc242435388" w:history="1">
+      <w:hyperlink w:anchor="_Toc242435986" w:history="1">
         <w:r>
           <w:rPr>
             <w:rStyle w:val="Hyperlink"/>
@@ -3045,7 +3045,7 @@
             <w:noProof/>
             <w:webHidden/>
           </w:rPr>
-          <w:instrText xml:space="preserve"> PAGEREF _Toc242435388 \h </w:instrText>
+          <w:instrText xml:space="preserve"> PAGEREF _Toc242435986 \h </w:instrText>
         </w:r>
         <w:r>
           <w:rPr>
@@ -3091,7 +3091,7 @@
           <w14:ligatures w14:val="standardContextual"/>
         </w:rPr>
       </w:pPr>
-      <w:hyperlink w:anchor="_Toc242435389" w:history="1">
+      <w:hyperlink w:anchor="_Toc242435987" w:history="1">
         <w:r>
           <w:rPr>
             <w:rStyle w:val="Hyperlink"/>
@@ -3119,7 +3119,7 @@
             <w:noProof/>
             <w:webHidden/>
           </w:rPr>
-          <w:instrText xml:space="preserve"> PAGEREF _Toc242435389 \h </w:instrText>
+          <w:instrText xml:space="preserve"> PAGEREF _Toc242435987 \h </w:instrText>
         </w:r>
         <w:r>
           <w:rPr>
@@ -3165,7 +3165,7 @@
           <w14:ligatures w14:val="standardContextual"/>
         </w:rPr>
       </w:pPr>
-      <w:hyperlink w:anchor="_Toc242435390" w:history="1">
+      <w:hyperlink w:anchor="_Toc242435988" w:history="1">
         <w:r>
           <w:rPr>
             <w:rStyle w:val="Hyperlink"/>
@@ -3193,7 +3193,7 @@
             <w:noProof/>
             <w:webHidden/>
           </w:rPr>
-          <w:instrText xml:space="preserve"> PAGEREF _Toc242435390 \h </w:instrText>
+          <w:instrText xml:space="preserve"> PAGEREF _Toc242435988 \h </w:instrText>
         </w:r>
         <w:r>
           <w:rPr>
@@ -3239,7 +3239,7 @@
           <w14:ligatures w14:val="standardContextual"/>
         </w:rPr>
       </w:pPr>
-      <w:hyperlink w:anchor="_Toc242435391" w:history="1">
+      <w:hyperlink w:anchor="_Toc242435989" w:history="1">
         <w:r>
           <w:rPr>
             <w:rStyle w:val="Hyperlink"/>
@@ -3267,7 +3267,7 @@
             <w:noProof/>
             <w:webHidden/>
           </w:rPr>
-          <w:instrText xml:space="preserve"> PAGEREF _Toc242435391 \h </w:instrText>
+          <w:instrText xml:space="preserve"> PAGEREF _Toc242435989 \h </w:instrText>
         </w:r>
         <w:r>
           <w:rPr>
@@ -3313,7 +3313,7 @@
           <w14:ligatures w14:val="standardContextual"/>
         </w:rPr>
       </w:pPr>
-      <w:hyperlink w:anchor="_Toc242435392" w:history="1">
+      <w:hyperlink w:anchor="_Toc242435990" w:history="1">
         <w:r>
           <w:rPr>
             <w:rStyle w:val="Hyperlink"/>
@@ -3341,7 +3341,7 @@
             <w:noProof/>
             <w:webHidden/>
           </w:rPr>
-          <w:instrText xml:space="preserve"> PAGEREF _Toc242435392 \h </w:instrText>
+          <w:instrText xml:space="preserve"> PAGEREF _Toc242435990 \h </w:instrText>
         </w:r>
         <w:r>
           <w:rPr>
@@ -3387,7 +3387,7 @@
           <w14:ligatures w14:val="standardContextual"/>
         </w:rPr>
       </w:pPr>
-      <w:hyperlink w:anchor="_Toc242435393" w:history="1">
+      <w:hyperlink w:anchor="_Toc242435991" w:history="1">
         <w:r>
           <w:rPr>
             <w:rStyle w:val="Hyperlink"/>
@@ -3415,7 +3415,7 @@
             <w:noProof/>
             <w:webHidden/>
           </w:rPr>
-          <w:instrText xml:space="preserve"> PAGEREF _Toc242435393 \h </w:instrText>
+          <w:instrText xml:space="preserve"> PAGEREF _Toc242435991 \h </w:instrText>
         </w:r>
         <w:r>
           <w:rPr>
@@ -3461,7 +3461,7 @@
           <w14:ligatures w14:val="standardContextual"/>
         </w:rPr>
       </w:pPr>
-      <w:hyperlink w:anchor="_Toc242435394" w:history="1">
+      <w:hyperlink w:anchor="_Toc242435992" w:history="1">
         <w:r>
           <w:rPr>
             <w:rStyle w:val="Hyperlink"/>
@@ -3489,7 +3489,7 @@
             <w:noProof/>
             <w:webHidden/>
           </w:rPr>
-          <w:instrText xml:space="preserve"> PAGEREF _Toc242435394 \h </w:instrText>
+          <w:instrText xml:space="preserve"> PAGEREF _Toc242435992 \h </w:instrText>
         </w:r>
         <w:r>
           <w:rPr>
@@ -3535,7 +3535,7 @@
           <w14:ligatures w14:val="standardContextual"/>
         </w:rPr>
       </w:pPr>
-      <w:hyperlink w:anchor="_Toc242435395" w:history="1">
+      <w:hyperlink w:anchor="_Toc242435993" w:history="1">
         <w:r>
           <w:rPr>
             <w:rStyle w:val="Hyperlink"/>
@@ -3563,7 +3563,7 @@
             <w:noProof/>
             <w:webHidden/>
           </w:rPr>
-          <w:instrText xml:space="preserve"> PAGEREF _Toc242435395 \h </w:instrText>
+          <w:instrText xml:space="preserve"> PAGEREF _Toc242435993 \h </w:instrText>
         </w:r>
         <w:r>
           <w:rPr>
@@ -3609,7 +3609,7 @@
           <w14:ligatures w14:val="standardContextual"/>
         </w:rPr>
       </w:pPr>
-      <w:hyperlink w:anchor="_Toc242435396" w:history="1">
+      <w:hyperlink w:anchor="_Toc242435994" w:history="1">
         <w:r>
           <w:rPr>
             <w:rStyle w:val="Hyperlink"/>
@@ -3637,7 +3637,7 @@
             <w:noProof/>
             <w:webHidden/>
           </w:rPr>
-          <w:instrText xml:space="preserve"> PAGEREF _Toc242435396 \h </w:instrText>
+          <w:instrText xml:space="preserve"> PAGEREF _Toc242435994 \h </w:instrText>
         </w:r>
         <w:r>
           <w:rPr>
@@ -3683,7 +3683,7 @@
           <w14:ligatures w14:val="standardContextual"/>
         </w:rPr>
       </w:pPr>
-      <w:hyperlink w:anchor="_Toc242435397" w:history="1">
+      <w:hyperlink w:anchor="_Toc242435995" w:history="1">
         <w:r>
           <w:rPr>
             <w:rStyle w:val="Hyperlink"/>
@@ -3711,7 +3711,7 @@
             <w:noProof/>
             <w:webHidden/>
           </w:rPr>
-          <w:instrText xml:space="preserve"> PAGEREF _Toc242435397 \h </w:instrText>
+          <w:instrText xml:space="preserve"> PAGEREF _Toc242435995 \h </w:instrText>
         </w:r>
         <w:r>
           <w:rPr>
@@ -3757,7 +3757,7 @@
           <w14:ligatures w14:val="standardContextual"/>
         </w:rPr>
       </w:pPr>
-      <w:hyperlink w:anchor="_Toc242435398" w:history="1">
+      <w:hyperlink w:anchor="_Toc242435996" w:history="1">
         <w:r>
           <w:rPr>
             <w:rStyle w:val="Hyperlink"/>
@@ -3785,7 +3785,7 @@
             <w:noProof/>
             <w:webHidden/>
           </w:rPr>
-          <w:instrText xml:space="preserve"> PAGEREF _Toc242435398 \h </w:instrText>
+          <w:instrText xml:space="preserve"> PAGEREF _Toc242435996 \h </w:instrText>
         </w:r>
         <w:r>
           <w:rPr>
@@ -3831,7 +3831,7 @@
           <w14:ligatures w14:val="standardContextual"/>
         </w:rPr>
       </w:pPr>
-      <w:hyperlink w:anchor="_Toc242435399" w:history="1">
+      <w:hyperlink w:anchor="_Toc242435997" w:history="1">
         <w:r>
           <w:rPr>
             <w:rStyle w:val="Hyperlink"/>
@@ -3858,7 +3858,7 @@
             <w:noProof/>
             <w:webHidden/>
           </w:rPr>
-          <w:instrText xml:space="preserve"> PAGEREF _Toc242435399 \h </w:instrText>
+          <w:instrText xml:space="preserve"> PAGEREF _Toc242435997 \h </w:instrText>
         </w:r>
         <w:r>
           <w:rPr>
@@ -3902,7 +3902,7 @@
         </w:rPr>
       </w:pPr>
       <w:bookmarkStart w:id="0" w:name="introducción-general"/>
-      <w:bookmarkStart w:id="1" w:name="_Toc242435353"/>
+      <w:bookmarkStart w:id="1" w:name="_Toc242435951"/>
       <w:r>
         <w:rPr>
           <w:lang w:val="es-AR"/>
@@ -3934,7 +3934,7 @@
         </w:rPr>
       </w:pPr>
       <w:bookmarkStart w:id="2" w:name="descripción-del-problema"/>
-      <w:bookmarkStart w:id="3" w:name="_Toc242435354"/>
+      <w:bookmarkStart w:id="3" w:name="_Toc242435952"/>
       <w:r>
         <w:rPr>
           <w:lang w:val="es-AR"/>
@@ -4083,7 +4083,7 @@
         </w:rPr>
       </w:pPr>
       <w:bookmarkStart w:id="4" w:name="estado-del-arte"/>
-      <w:bookmarkStart w:id="5" w:name="_Toc242435355"/>
+      <w:bookmarkStart w:id="5" w:name="_Toc242435953"/>
       <w:bookmarkEnd w:id="2"/>
       <w:r>
         <w:rPr>
@@ -4178,7 +4178,7 @@
         </w:rPr>
       </w:pPr>
       <w:bookmarkStart w:id="6" w:name="motivación"/>
-      <w:bookmarkStart w:id="7" w:name="_Toc242435356"/>
+      <w:bookmarkStart w:id="7" w:name="_Toc242435954"/>
       <w:bookmarkEnd w:id="4"/>
       <w:r>
         <w:rPr>
@@ -4224,7 +4224,7 @@
         </w:rPr>
       </w:pPr>
       <w:bookmarkStart w:id="8" w:name="objetivos-y-alcance"/>
-      <w:bookmarkStart w:id="9" w:name="_Toc242435357"/>
+      <w:bookmarkStart w:id="9" w:name="_Toc242435955"/>
       <w:bookmarkEnd w:id="6"/>
       <w:r>
         <w:rPr>
@@ -4242,7 +4242,7 @@
         </w:rPr>
       </w:pPr>
       <w:bookmarkStart w:id="10" w:name="objetivos"/>
-      <w:bookmarkStart w:id="11" w:name="_Toc242435358"/>
+      <w:bookmarkStart w:id="11" w:name="_Toc242435956"/>
       <w:r>
         <w:rPr>
           <w:lang w:val="es-AR"/>
@@ -4399,7 +4399,7 @@
         </w:rPr>
       </w:pPr>
       <w:bookmarkStart w:id="12" w:name="alcance"/>
-      <w:bookmarkStart w:id="13" w:name="_Toc242435359"/>
+      <w:bookmarkStart w:id="13" w:name="_Toc242435957"/>
       <w:bookmarkEnd w:id="10"/>
       <w:r>
         <w:rPr>
@@ -4614,7 +4614,7 @@
         </w:rPr>
       </w:pPr>
       <w:bookmarkStart w:id="14" w:name="introducción-específica"/>
-      <w:bookmarkStart w:id="15" w:name="_Toc242435360"/>
+      <w:bookmarkStart w:id="15" w:name="_Toc242435958"/>
       <w:bookmarkEnd w:id="0"/>
       <w:bookmarkEnd w:id="8"/>
       <w:bookmarkEnd w:id="12"/>
@@ -4649,7 +4649,7 @@
         </w:rPr>
       </w:pPr>
       <w:bookmarkStart w:id="16" w:name="aplicaciones-web"/>
-      <w:bookmarkStart w:id="17" w:name="_Toc242435361"/>
+      <w:bookmarkStart w:id="17" w:name="_Toc242435959"/>
       <w:r>
         <w:rPr>
           <w:lang w:val="es-AR"/>
@@ -4912,7 +4912,7 @@
         </w:rPr>
       </w:pPr>
       <w:bookmarkStart w:id="18" w:name="virtualización-ligera-con-contenedores"/>
-      <w:bookmarkStart w:id="19" w:name="_Toc242435362"/>
+      <w:bookmarkStart w:id="19" w:name="_Toc242435960"/>
       <w:bookmarkEnd w:id="16"/>
       <w:r>
         <w:rPr>
@@ -4987,7 +4987,7 @@
         </w:rPr>
       </w:pPr>
       <w:bookmarkStart w:id="20" w:name="tecnología-rfid"/>
-      <w:bookmarkStart w:id="21" w:name="_Toc242435363"/>
+      <w:bookmarkStart w:id="21" w:name="_Toc242435961"/>
       <w:bookmarkEnd w:id="18"/>
       <w:r>
         <w:rPr>
@@ -5047,7 +5047,7 @@
         </w:rPr>
       </w:pPr>
       <w:bookmarkStart w:id="22" w:name="sistema-vitte"/>
-      <w:bookmarkStart w:id="23" w:name="_Toc242435364"/>
+      <w:bookmarkStart w:id="23" w:name="_Toc242435962"/>
       <w:bookmarkEnd w:id="20"/>
       <w:r>
         <w:rPr>
@@ -5144,7 +5144,7 @@
         </w:rPr>
       </w:pPr>
       <w:bookmarkStart w:id="24" w:name="máquinas-dispensadoras"/>
-      <w:bookmarkStart w:id="25" w:name="_Toc242435365"/>
+      <w:bookmarkStart w:id="25" w:name="_Toc242435963"/>
       <w:r>
         <w:rPr>
           <w:lang w:val="es-AR"/>
@@ -5216,7 +5216,7 @@
         </w:rPr>
       </w:pPr>
       <w:bookmarkStart w:id="26" w:name="nube"/>
-      <w:bookmarkStart w:id="27" w:name="_Toc242435366"/>
+      <w:bookmarkStart w:id="27" w:name="_Toc242435964"/>
       <w:bookmarkEnd w:id="24"/>
       <w:r>
         <w:rPr>
@@ -5833,7 +5833,7 @@
         </w:rPr>
       </w:pPr>
       <w:bookmarkStart w:id="28" w:name="sistema-fudo"/>
-      <w:bookmarkStart w:id="29" w:name="_Toc242435367"/>
+      <w:bookmarkStart w:id="29" w:name="_Toc242435965"/>
       <w:bookmarkEnd w:id="22"/>
       <w:bookmarkEnd w:id="26"/>
       <w:r>
@@ -5881,7 +5881,7 @@
         </w:rPr>
       </w:pPr>
       <w:bookmarkStart w:id="30" w:name="requerimientos"/>
-      <w:bookmarkStart w:id="31" w:name="_Toc242435368"/>
+      <w:bookmarkStart w:id="31" w:name="_Toc242435966"/>
       <w:bookmarkEnd w:id="28"/>
       <w:r>
         <w:rPr>
@@ -5913,7 +5913,7 @@
         </w:rPr>
       </w:pPr>
       <w:bookmarkStart w:id="32" w:name="requerimientos-funcionales"/>
-      <w:bookmarkStart w:id="33" w:name="_Toc242435369"/>
+      <w:bookmarkStart w:id="33" w:name="_Toc242435967"/>
       <w:r>
         <w:rPr>
           <w:lang w:val="es-AR"/>
@@ -6833,7 +6833,7 @@
         </w:rPr>
       </w:pPr>
       <w:bookmarkStart w:id="34" w:name="requerimientos-no-funcionales"/>
-      <w:bookmarkStart w:id="35" w:name="_Toc242435370"/>
+      <w:bookmarkStart w:id="35" w:name="_Toc242435968"/>
       <w:bookmarkEnd w:id="32"/>
       <w:r>
         <w:rPr>
@@ -7281,7 +7281,7 @@
         <w:pStyle w:val="Heading3"/>
       </w:pPr>
       <w:bookmarkStart w:id="36" w:name="restricciones"/>
-      <w:bookmarkStart w:id="37" w:name="_Toc242435371"/>
+      <w:bookmarkStart w:id="37" w:name="_Toc242435969"/>
       <w:bookmarkEnd w:id="34"/>
       <w:r>
         <w:t>2.6.3. Restricciones</w:t>
@@ -7368,7 +7368,7 @@
         </w:rPr>
       </w:pPr>
       <w:bookmarkStart w:id="38" w:name="planificación"/>
-      <w:bookmarkStart w:id="39" w:name="_Toc242435372"/>
+      <w:bookmarkStart w:id="39" w:name="_Toc242435970"/>
       <w:bookmarkEnd w:id="30"/>
       <w:bookmarkEnd w:id="36"/>
       <w:r>
@@ -7387,7 +7387,7 @@
         </w:rPr>
       </w:pPr>
       <w:bookmarkStart w:id="40" w:name="plan-de-trabajo"/>
-      <w:bookmarkStart w:id="41" w:name="_Toc242435373"/>
+      <w:bookmarkStart w:id="41" w:name="_Toc242435971"/>
       <w:r>
         <w:rPr>
           <w:lang w:val="es-AR"/>
@@ -8362,7 +8362,7 @@
         </w:rPr>
       </w:pPr>
       <w:bookmarkStart w:id="42" w:name="análisis-de-riesgos"/>
-      <w:bookmarkStart w:id="43" w:name="_Toc242435374"/>
+      <w:bookmarkStart w:id="43" w:name="_Toc242435972"/>
       <w:bookmarkEnd w:id="40"/>
       <w:r>
         <w:rPr>
@@ -9471,7 +9471,7 @@
         </w:rPr>
       </w:pPr>
       <w:bookmarkStart w:id="44" w:name="diseño-e-implementación"/>
-      <w:bookmarkStart w:id="45" w:name="_Toc242435375"/>
+      <w:bookmarkStart w:id="45" w:name="_Toc242435973"/>
       <w:bookmarkEnd w:id="14"/>
       <w:bookmarkEnd w:id="38"/>
       <w:bookmarkEnd w:id="42"/>
@@ -9531,7 +9531,7 @@
         <w:pStyle w:val="Heading2"/>
       </w:pPr>
       <w:bookmarkStart w:id="46" w:name="casos-de-uso"/>
-      <w:bookmarkStart w:id="47" w:name="_Toc242435376"/>
+      <w:bookmarkStart w:id="47" w:name="_Toc242435974"/>
       <w:r>
         <w:t>3.1. Casos de uso</w:t>
       </w:r>
@@ -9542,7 +9542,7 @@
         <w:pStyle w:val="Heading3"/>
       </w:pPr>
       <w:bookmarkStart w:id="48" w:name="actores"/>
-      <w:bookmarkStart w:id="49" w:name="_Toc242435377"/>
+      <w:bookmarkStart w:id="49" w:name="_Toc242435975"/>
       <w:r>
         <w:t>3.1.1. Actores</w:t>
       </w:r>
@@ -9664,7 +9664,7 @@
         </w:rPr>
       </w:pPr>
       <w:bookmarkStart w:id="50" w:name="diagrama-de-contexto"/>
-      <w:bookmarkStart w:id="51" w:name="_Toc242435378"/>
+      <w:bookmarkStart w:id="51" w:name="_Toc242435976"/>
       <w:bookmarkEnd w:id="48"/>
       <w:r>
         <w:rPr>
@@ -9761,7 +9761,7 @@
         </w:rPr>
       </w:pPr>
       <w:bookmarkStart w:id="52" w:name="diagrama-de-casos-de-uso"/>
-      <w:bookmarkStart w:id="53" w:name="_Toc242435379"/>
+      <w:bookmarkStart w:id="53" w:name="_Toc242435977"/>
       <w:bookmarkEnd w:id="50"/>
       <w:r>
         <w:rPr>
@@ -9796,7 +9796,7 @@
         </w:rPr>
         <w:lastRenderedPageBreak/>
         <w:drawing>
-          <wp:anchor distT="0" distB="0" distL="114300" distR="114300" simplePos="0" relativeHeight="251655168" behindDoc="0" locked="0" layoutInCell="1" allowOverlap="1" wp14:anchorId="4EE63E4A" wp14:editId="42043237">
+          <wp:anchor distT="0" distB="0" distL="114300" distR="114300" simplePos="0" relativeHeight="251656192" behindDoc="0" locked="0" layoutInCell="1" allowOverlap="1" wp14:anchorId="4EE63E4A" wp14:editId="42043237">
             <wp:simplePos x="0" y="0"/>
             <wp:positionH relativeFrom="column">
               <wp:posOffset>-522716</wp:posOffset>
@@ -9874,7 +9874,7 @@
         </w:rPr>
       </w:pPr>
       <w:bookmarkStart w:id="54" w:name="Xcd8275318fe8de60034d52dad49544afdc694e0"/>
-      <w:bookmarkStart w:id="55" w:name="_Toc242435380"/>
+      <w:bookmarkStart w:id="55" w:name="_Toc242435978"/>
       <w:bookmarkEnd w:id="52"/>
       <w:r>
         <w:rPr>
@@ -10468,7 +10468,7 @@
         </w:rPr>
       </w:pPr>
       <w:bookmarkStart w:id="56" w:name="arquitectura-propuesta"/>
-      <w:bookmarkStart w:id="57" w:name="_Toc242435381"/>
+      <w:bookmarkStart w:id="57" w:name="_Toc242435979"/>
       <w:bookmarkEnd w:id="46"/>
       <w:bookmarkEnd w:id="54"/>
       <w:r>
@@ -10491,7 +10491,7 @@
           <w:noProof/>
         </w:rPr>
         <w:drawing>
-          <wp:anchor distT="0" distB="0" distL="114300" distR="114300" simplePos="0" relativeHeight="251653120" behindDoc="0" locked="0" layoutInCell="1" allowOverlap="1" wp14:anchorId="34997FC1" wp14:editId="38027D4C">
+          <wp:anchor distT="0" distB="0" distL="114300" distR="114300" simplePos="0" relativeHeight="251654144" behindDoc="0" locked="0" layoutInCell="1" allowOverlap="1" wp14:anchorId="34997FC1" wp14:editId="38027D4C">
             <wp:simplePos x="0" y="0"/>
             <wp:positionH relativeFrom="column">
               <wp:posOffset>-666750</wp:posOffset>
@@ -10816,7 +10816,7 @@
         </w:rPr>
       </w:pPr>
       <w:bookmarkStart w:id="58" w:name="consideraciones-de-autenticación"/>
-      <w:bookmarkStart w:id="59" w:name="_Toc242435382"/>
+      <w:bookmarkStart w:id="59" w:name="_Toc242435980"/>
       <w:bookmarkEnd w:id="56"/>
       <w:r>
         <w:rPr>
@@ -11060,7 +11060,7 @@
         </w:rPr>
       </w:pPr>
       <w:bookmarkStart w:id="60" w:name="consideraciones-de-red"/>
-      <w:bookmarkStart w:id="61" w:name="_Toc242435383"/>
+      <w:bookmarkStart w:id="61" w:name="_Toc242435981"/>
       <w:bookmarkEnd w:id="58"/>
       <w:r>
         <w:rPr>
@@ -11677,7 +11677,7 @@
         </w:rPr>
       </w:pPr>
       <w:bookmarkStart w:id="62" w:name="consideraciones-de-la-terminal-de-tapeo"/>
-      <w:bookmarkStart w:id="63" w:name="_Toc242435384"/>
+      <w:bookmarkStart w:id="63" w:name="_Toc242435982"/>
       <w:bookmarkEnd w:id="60"/>
       <w:r>
         <w:rPr>
@@ -11695,7 +11695,7 @@
         </w:rPr>
       </w:pPr>
       <w:bookmarkStart w:id="64" w:name="formas-de-uso-esperadas"/>
-      <w:bookmarkStart w:id="65" w:name="_Toc242435385"/>
+      <w:bookmarkStart w:id="65" w:name="_Toc242435983"/>
       <w:r>
         <w:rPr>
           <w:lang w:val="es-AR"/>
@@ -11776,7 +11776,7 @@
         </w:rPr>
       </w:pPr>
       <w:bookmarkStart w:id="66" w:name="uso-de-lectores-sin-asociar"/>
-      <w:bookmarkStart w:id="67" w:name="_Toc242435386"/>
+      <w:bookmarkStart w:id="67" w:name="_Toc242435984"/>
       <w:bookmarkEnd w:id="64"/>
       <w:r>
         <w:rPr>
@@ -11808,7 +11808,7 @@
         </w:rPr>
       </w:pPr>
       <w:bookmarkStart w:id="68" w:name="uso-de-lectores-con-asociación"/>
-      <w:bookmarkStart w:id="69" w:name="_Toc242435387"/>
+      <w:bookmarkStart w:id="69" w:name="_Toc242435985"/>
       <w:bookmarkEnd w:id="66"/>
       <w:r>
         <w:rPr>
@@ -11991,7 +11991,7 @@
           <w:noProof/>
         </w:rPr>
         <w:drawing>
-          <wp:anchor distT="0" distB="0" distL="114300" distR="114300" simplePos="0" relativeHeight="251661312" behindDoc="0" locked="0" layoutInCell="1" allowOverlap="1" wp14:anchorId="09F49644" wp14:editId="512CB32C">
+          <wp:anchor distT="0" distB="0" distL="114300" distR="114300" simplePos="0" relativeHeight="251659264" behindDoc="0" locked="0" layoutInCell="1" allowOverlap="1" wp14:anchorId="09F49644" wp14:editId="30B8173C">
             <wp:simplePos x="0" y="0"/>
             <wp:positionH relativeFrom="column">
               <wp:posOffset>-213995</wp:posOffset>
@@ -12244,7 +12244,7 @@
         </w:rPr>
       </w:pPr>
       <w:bookmarkStart w:id="70" w:name="display-del-cliente"/>
-      <w:bookmarkStart w:id="71" w:name="_Toc242435388"/>
+      <w:bookmarkStart w:id="71" w:name="_Toc242435986"/>
       <w:bookmarkEnd w:id="68"/>
       <w:r>
         <w:rPr>
@@ -12332,7 +12332,7 @@
         </w:rPr>
       </w:pPr>
       <w:bookmarkStart w:id="72" w:name="desarrollo-del-backend"/>
-      <w:bookmarkStart w:id="73" w:name="_Toc242435389"/>
+      <w:bookmarkStart w:id="73" w:name="_Toc242435987"/>
       <w:bookmarkEnd w:id="62"/>
       <w:bookmarkEnd w:id="70"/>
       <w:r>
@@ -12351,7 +12351,7 @@
         </w:rPr>
       </w:pPr>
       <w:bookmarkStart w:id="74" w:name="diseño-de-la-base-de-datos"/>
-      <w:bookmarkStart w:id="75" w:name="_Toc242435390"/>
+      <w:bookmarkStart w:id="75" w:name="_Toc242435988"/>
       <w:r>
         <w:rPr>
           <w:lang w:val="es-AR"/>
@@ -12384,7 +12384,7 @@
         </w:rPr>
         <w:lastRenderedPageBreak/>
         <w:drawing>
-          <wp:anchor distT="0" distB="0" distL="114300" distR="114300" simplePos="0" relativeHeight="251663360" behindDoc="0" locked="0" layoutInCell="1" allowOverlap="1" wp14:anchorId="088DAA01" wp14:editId="3AE28E07">
+          <wp:anchor distT="0" distB="0" distL="114300" distR="114300" simplePos="0" relativeHeight="251660288" behindDoc="0" locked="0" layoutInCell="1" allowOverlap="1" wp14:anchorId="088DAA01" wp14:editId="3AE28E07">
             <wp:simplePos x="0" y="0"/>
             <wp:positionH relativeFrom="column">
               <wp:posOffset>-483870</wp:posOffset>
@@ -13734,7 +13734,7 @@
         </w:rPr>
       </w:pPr>
       <w:bookmarkStart w:id="76" w:name="organización-en-capas"/>
-      <w:bookmarkStart w:id="77" w:name="_Toc242435391"/>
+      <w:bookmarkStart w:id="77" w:name="_Toc242435989"/>
       <w:bookmarkEnd w:id="74"/>
       <w:r>
         <w:rPr>
@@ -14630,7 +14630,7 @@
         </w:rPr>
       </w:pPr>
       <w:bookmarkStart w:id="78" w:name="lógica-de-pedidos-y-montos-máximos"/>
-      <w:bookmarkStart w:id="79" w:name="_Toc242435392"/>
+      <w:bookmarkStart w:id="79" w:name="_Toc242435990"/>
       <w:bookmarkEnd w:id="76"/>
       <w:r>
         <w:rPr>
@@ -14690,7 +14690,7 @@
         </w:rPr>
       </w:pPr>
       <w:bookmarkStart w:id="80" w:name="integración-con-vitte"/>
-      <w:bookmarkStart w:id="81" w:name="_Toc242435393"/>
+      <w:bookmarkStart w:id="81" w:name="_Toc242435991"/>
       <w:bookmarkEnd w:id="78"/>
       <w:r>
         <w:rPr>
@@ -14972,7 +14972,7 @@
         </w:rPr>
         <w:lastRenderedPageBreak/>
         <w:drawing>
-          <wp:anchor distT="0" distB="0" distL="114300" distR="114300" simplePos="0" relativeHeight="251665408" behindDoc="0" locked="0" layoutInCell="1" allowOverlap="1" wp14:anchorId="111C6599" wp14:editId="206F83BA">
+          <wp:anchor distT="0" distB="0" distL="114300" distR="114300" simplePos="0" relativeHeight="251661312" behindDoc="0" locked="0" layoutInCell="1" allowOverlap="1" wp14:anchorId="111C6599" wp14:editId="0EC82ECD">
             <wp:simplePos x="0" y="0"/>
             <wp:positionH relativeFrom="column">
               <wp:posOffset>-253807</wp:posOffset>
@@ -15235,7 +15235,7 @@
           <w:noProof/>
         </w:rPr>
         <w:drawing>
-          <wp:inline distT="0" distB="0" distL="0" distR="0" wp14:anchorId="02EDCDAD" wp14:editId="0B4D610C">
+          <wp:inline distT="0" distB="0" distL="0" distR="0" wp14:anchorId="02EDCDAD" wp14:editId="6962CFBB">
             <wp:extent cx="5333998" cy="1170214"/>
             <wp:effectExtent l="0" t="0" r="0" b="0"/>
             <wp:docPr id="81" name="Picture"/>
@@ -15347,7 +15347,7 @@
         </w:rPr>
       </w:pPr>
       <w:bookmarkStart w:id="83" w:name="integración-con-fudo"/>
-      <w:bookmarkStart w:id="84" w:name="_Toc242435394"/>
+      <w:bookmarkStart w:id="84" w:name="_Toc242435992"/>
       <w:bookmarkEnd w:id="80"/>
       <w:bookmarkEnd w:id="82"/>
       <w:r>
@@ -15538,7 +15538,7 @@
         </w:rPr>
       </w:pPr>
       <w:bookmarkStart w:id="85" w:name="exportación-de-órdenes"/>
-      <w:bookmarkStart w:id="86" w:name="_Toc242435395"/>
+      <w:bookmarkStart w:id="86" w:name="_Toc242435993"/>
       <w:bookmarkEnd w:id="83"/>
       <w:r>
         <w:rPr>
@@ -15584,7 +15584,7 @@
         </w:rPr>
       </w:pPr>
       <w:bookmarkStart w:id="87" w:name="desarrollo-del-frontend"/>
-      <w:bookmarkStart w:id="88" w:name="_Toc242435396"/>
+      <w:bookmarkStart w:id="88" w:name="_Toc242435994"/>
       <w:bookmarkEnd w:id="72"/>
       <w:bookmarkEnd w:id="85"/>
       <w:r>
@@ -16035,7 +16035,7 @@
         </w:rPr>
       </w:pPr>
       <w:bookmarkStart w:id="89" w:name="integración"/>
-      <w:bookmarkStart w:id="90" w:name="_Toc242435397"/>
+      <w:bookmarkStart w:id="90" w:name="_Toc242435995"/>
       <w:bookmarkEnd w:id="44"/>
       <w:bookmarkEnd w:id="87"/>
       <w:r>
@@ -16167,7 +16167,7 @@
         </w:rPr>
       </w:pPr>
       <w:bookmarkStart w:id="91" w:name="conclusiones"/>
-      <w:bookmarkStart w:id="92" w:name="_Toc242435398"/>
+      <w:bookmarkStart w:id="92" w:name="_Toc242435996"/>
       <w:bookmarkEnd w:id="89"/>
       <w:r>
         <w:rPr>
@@ -16304,7 +16304,7 @@
         <w:pStyle w:val="Heading1"/>
       </w:pPr>
       <w:bookmarkStart w:id="94" w:name="referencias-bibliográficas"/>
-      <w:bookmarkStart w:id="95" w:name="_Toc242435399"/>
+      <w:bookmarkStart w:id="95" w:name="_Toc242435997"/>
       <w:bookmarkEnd w:id="91"/>
       <w:bookmarkEnd w:id="93"/>
       <w:r>
@@ -16743,136 +16743,92 @@
 
 <file path=word/footer1.xml><?xml version="1.0" encoding="utf-8"?>
 <w:ftr xmlns:wpc="http://schemas.microsoft.com/office/word/2010/wordprocessingCanvas" xmlns:cx="http://schemas.microsoft.com/office/drawing/2014/chartex" xmlns:cx1="http://schemas.microsoft.com/office/drawing/2015/9/8/chartex" xmlns:cx2="http://schemas.microsoft.com/office/drawing/2015/10/21/chartex" xmlns:cx3="http://schemas.microsoft.com/office/drawing/2016/5/9/chartex" xmlns:cx4="http://schemas.microsoft.com/office/drawing/2016/5/10/chartex" xmlns:cx5="http://schemas.microsoft.com/office/drawing/2016/5/11/chartex" xmlns:cx6="http://schemas.microsoft.com/office/drawing/2016/5/12/chartex" xmlns:cx7="http://schemas.microsoft.com/office/drawing/2016/5/13/chartex" xmlns:cx8="http://schemas.microsoft.com/office/drawing/2016/5/14/chartex" xmlns:mc="http://schemas.openxmlformats.org/markup-compatibility/2006" xmlns:aink="http://schemas.microsoft.com/office/drawing/2016/ink" xmlns:am3d="http://schemas.microsoft.com/office/drawing/2017/model3d" xmlns:o="urn:schemas-microsoft-com:office:office" xmlns:oel="http://schemas.microsoft.com/office/2019/extlst" xmlns:r="http://schemas.openxmlformats.org/officeDocument/2006/relationships" xmlns:m="http://schemas.openxmlformats.org/officeDocument/2006/math" xmlns:v="urn:schemas-microsoft-com:vml" xmlns:wp14="http://schemas.microsoft.com/office/word/2010/wordprocessingDrawing" xmlns:wp="http://schemas.openxmlformats.org/drawingml/2006/wordprocessingDrawing" xmlns:w10="urn:schemas-microsoft-com:office:word" xmlns:w="http://schemas.openxmlformats.org/wordprocessingml/2006/main" xmlns:w14="http://schemas.microsoft.com/office/word/2010/wordml" xmlns:w15="http://schemas.microsoft.com/office/word/2012/wordml" xmlns:w16cex="http://schemas.microsoft.com/office/word/2018/wordml/cex" xmlns:w16cid="http://schemas.microsoft.com/office/word/2016/wordml/cid" xmlns:w16="http://schemas.microsoft.com/office/word/2018/wordml" xmlns:w16du="http://schemas.microsoft.com/office/word/2023/wordml/word16du" xmlns:w16sdtdh="http://schemas.microsoft.com/office/word/2020/wordml/sdtdatahash" xmlns:w16sdtfl="http://schemas.microsoft.com/office/word/2024/wordml/sdtformatlock" xmlns:w16se="http://schemas.microsoft.com/office/word/2015/wordml/symex" xmlns:wpg="http://schemas.microsoft.com/office/word/2010/wordprocessingGroup" xmlns:wpi="http://schemas.microsoft.com/office/word/2010/wordprocessingInk" xmlns:wne="http://schemas.microsoft.com/office/word/2006/wordml" xmlns:wps="http://schemas.microsoft.com/office/word/2010/wordprocessingShape" mc:Ignorable="w14 w15 w16se w16cid w16 w16cex w16sdtdh w16sdtfl w16du wp14">
-  <w:tbl>
-    <w:tblPr>
-      <w:tblW w:w="5000" w:type="pct"/>
-      <w:tblCellMar>
-        <w:left w:w="0" w:type="dxa"/>
-        <w:right w:w="0" w:type="dxa"/>
-      </w:tblCellMar>
-      <w:tblLook w:val="04A0" w:firstRow="1" w:lastRow="0" w:firstColumn="1" w:lastColumn="0" w:noHBand="0" w:noVBand="1"/>
-    </w:tblPr>
-    <w:tblGrid>
-      <w:gridCol w:w="4084"/>
-      <w:gridCol w:w="340"/>
-      <w:gridCol w:w="4081"/>
-    </w:tblGrid>
-    <w:tr>
-      <w:tc>
-        <w:tcPr>
-          <w:tcW w:w="2401" w:type="pct"/>
-        </w:tcPr>
-        <w:p>
-          <w:pPr>
-            <w:pStyle w:val="Footer"/>
-            <w:rPr>
-              <w:caps/>
-              <w:color w:val="156082" w:themeColor="accent1"/>
-              <w:sz w:val="18"/>
-              <w:szCs w:val="18"/>
-            </w:rPr>
-          </w:pPr>
-          <w:sdt>
-            <w:sdtPr>
-              <w:rPr>
-                <w:caps/>
-                <w:color w:val="156082" w:themeColor="accent1"/>
-                <w:sz w:val="18"/>
-                <w:szCs w:val="18"/>
-              </w:rPr>
-              <w:alias w:val="Title"/>
-              <w:tag w:val=""/>
-              <w:id w:val="886384654"/>
-              <w:placeholder>
-                <w:docPart w:val="C7ED24F1327D45379748EBB7AC0BD389"/>
-              </w:placeholder>
-              <w:showingPlcHdr/>
-              <w:dataBinding w:prefixMappings="xmlns:ns0='http://purl.org/dc/elements/1.1/' xmlns:ns1='http://schemas.openxmlformats.org/package/2006/metadata/core-properties' " w:xpath="/ns1:coreProperties[1]/ns0:title[1]" w:storeItemID="{6C3C8BC8-F283-45AE-878A-BAB7291924A1}"/>
-              <w:text/>
-            </w:sdtPr>
-            <w:sdtContent>
-              <w:r>
-                <w:rPr>
-                  <w:caps/>
-                  <w:color w:val="156082" w:themeColor="accent1"/>
-                  <w:sz w:val="18"/>
-                  <w:szCs w:val="18"/>
-                </w:rPr>
-                <w:t>[Document title]</w:t>
-              </w:r>
-            </w:sdtContent>
-          </w:sdt>
-        </w:p>
-      </w:tc>
-      <w:tc>
-        <w:tcPr>
-          <w:tcW w:w="200" w:type="pct"/>
-        </w:tcPr>
-        <w:p>
-          <w:pPr>
-            <w:pStyle w:val="Footer"/>
-            <w:rPr>
-              <w:caps/>
-              <w:color w:val="156082" w:themeColor="accent1"/>
-              <w:sz w:val="18"/>
-              <w:szCs w:val="18"/>
-            </w:rPr>
-          </w:pPr>
-        </w:p>
-      </w:tc>
-      <w:tc>
-        <w:tcPr>
-          <w:tcW w:w="2402" w:type="pct"/>
-        </w:tcPr>
-        <w:sdt>
-          <w:sdtPr>
-            <w:rPr>
-              <w:caps/>
-              <w:color w:val="156082" w:themeColor="accent1"/>
-              <w:sz w:val="18"/>
-              <w:szCs w:val="18"/>
-            </w:rPr>
-            <w:alias w:val="Author"/>
-            <w:tag w:val=""/>
-            <w:id w:val="1205441952"/>
-            <w:placeholder>
-              <w:docPart w:val="791664737FBA48A58C501B39BDD9B8FA"/>
-            </w:placeholder>
-            <w:showingPlcHdr/>
-            <w:dataBinding w:prefixMappings="xmlns:ns0='http://purl.org/dc/elements/1.1/' xmlns:ns1='http://schemas.openxmlformats.org/package/2006/metadata/core-properties' " w:xpath="/ns1:coreProperties[1]/ns0:creator[1]" w:storeItemID="{6C3C8BC8-F283-45AE-878A-BAB7291924A1}"/>
-            <w:text/>
-          </w:sdtPr>
-          <w:sdtContent>
-            <w:p>
-              <w:pPr>
-                <w:pStyle w:val="Footer"/>
-                <w:jc w:val="right"/>
-                <w:rPr>
-                  <w:caps/>
-                  <w:color w:val="156082" w:themeColor="accent1"/>
-                  <w:sz w:val="18"/>
-                  <w:szCs w:val="18"/>
-                </w:rPr>
-              </w:pPr>
-              <w:r>
-                <w:rPr>
-                  <w:caps/>
-                  <w:color w:val="156082" w:themeColor="accent1"/>
-                  <w:sz w:val="18"/>
-                  <w:szCs w:val="18"/>
-                </w:rPr>
-                <w:t>[Author name]</w:t>
-              </w:r>
-            </w:p>
-          </w:sdtContent>
-        </w:sdt>
-      </w:tc>
-    </w:tr>
-  </w:tbl>
   <w:p>
     <w:pPr>
       <w:pStyle w:val="Footer"/>
+      <w:rPr>
+        <w:sz w:val="20"/>
+        <w:szCs w:val="20"/>
+      </w:rPr>
     </w:pPr>
+    <w:r>
+      <w:rPr>
+        <w:sz w:val="20"/>
+        <w:szCs w:val="20"/>
+      </w:rPr>
+      <w:fldChar w:fldCharType="begin"/>
+    </w:r>
+    <w:r>
+      <w:rPr>
+        <w:sz w:val="20"/>
+        <w:szCs w:val="20"/>
+      </w:rPr>
+      <w:instrText xml:space="preserve"> STYLEREF "Heading 1" </w:instrText>
+    </w:r>
+    <w:r>
+      <w:rPr>
+        <w:sz w:val="20"/>
+        <w:szCs w:val="20"/>
+      </w:rPr>
+      <w:fldChar w:fldCharType="separate"/>
+    </w:r>
+    <w:r>
+      <w:rPr>
+        <w:noProof/>
+        <w:sz w:val="20"/>
+        <w:szCs w:val="20"/>
+      </w:rPr>
+      <w:t>2. Introducción específica</w:t>
+    </w:r>
+    <w:r>
+      <w:rPr>
+        <w:sz w:val="20"/>
+        <w:szCs w:val="20"/>
+      </w:rPr>
+      <w:fldChar w:fldCharType="end"/>
+    </w:r>
+    <w:r>
+      <w:rPr>
+        <w:sz w:val="20"/>
+        <w:szCs w:val="20"/>
+      </w:rPr>
+      <w:tab/>
+    </w:r>
+    <w:r>
+      <w:rPr>
+        <w:sz w:val="20"/>
+        <w:szCs w:val="20"/>
+      </w:rPr>
+      <w:fldChar w:fldCharType="begin"/>
+    </w:r>
+    <w:r>
+      <w:rPr>
+        <w:sz w:val="20"/>
+        <w:szCs w:val="20"/>
+      </w:rPr>
+      <w:instrText xml:space="preserve"> PAGE </w:instrText>
+    </w:r>
+    <w:r>
+      <w:rPr>
+        <w:sz w:val="20"/>
+        <w:szCs w:val="20"/>
+      </w:rPr>
+      <w:fldChar w:fldCharType="separate"/>
+    </w:r>
+    <w:r>
+      <w:rPr>
+        <w:sz w:val="20"/>
+        <w:szCs w:val="20"/>
+      </w:rPr>
+      <w:t>2</w:t>
+    </w:r>
+    <w:r>
+      <w:rPr>
+        <w:sz w:val="20"/>
+        <w:szCs w:val="20"/>
+      </w:rPr>
+      <w:fldChar w:fldCharType="end"/>
+    </w:r>
   </w:p>
 </w:ftr>
 </file>
@@ -18700,609 +18656,6 @@
 </w:styles>
 </file>
 
-<file path=word/glossary/document.xml><?xml version="1.0" encoding="utf-8"?>
-<w:glossaryDocument xmlns:wpc="http://schemas.microsoft.com/office/word/2010/wordprocessingCanvas" xmlns:cx="http://schemas.microsoft.com/office/drawing/2014/chartex" xmlns:cx1="http://schemas.microsoft.com/office/drawing/2015/9/8/chartex" xmlns:cx2="http://schemas.microsoft.com/office/drawing/2015/10/21/chartex" xmlns:cx3="http://schemas.microsoft.com/office/drawing/2016/5/9/chartex" xmlns:cx4="http://schemas.microsoft.com/office/drawing/2016/5/10/chartex" xmlns:cx5="http://schemas.microsoft.com/office/drawing/2016/5/11/chartex" xmlns:cx6="http://schemas.microsoft.com/office/drawing/2016/5/12/chartex" xmlns:cx7="http://schemas.microsoft.com/office/drawing/2016/5/13/chartex" xmlns:cx8="http://schemas.microsoft.com/office/drawing/2016/5/14/chartex" xmlns:mc="http://schemas.openxmlformats.org/markup-compatibility/2006" xmlns:aink="http://schemas.microsoft.com/office/drawing/2016/ink" xmlns:am3d="http://schemas.microsoft.com/office/drawing/2017/model3d" xmlns:o="urn:schemas-microsoft-com:office:office" xmlns:oel="http://schemas.microsoft.com/office/2019/extlst" xmlns:r="http://schemas.openxmlformats.org/officeDocument/2006/relationships" xmlns:m="http://schemas.openxmlformats.org/officeDocument/2006/math" xmlns:v="urn:schemas-microsoft-com:vml" xmlns:wp14="http://schemas.microsoft.com/office/word/2010/wordprocessingDrawing" xmlns:wp="http://schemas.openxmlformats.org/drawingml/2006/wordprocessingDrawing" xmlns:w10="urn:schemas-microsoft-com:office:word" xmlns:w="http://schemas.openxmlformats.org/wordprocessingml/2006/main" xmlns:w14="http://schemas.microsoft.com/office/word/2010/wordml" xmlns:w15="http://schemas.microsoft.com/office/word/2012/wordml" xmlns:w16cex="http://schemas.microsoft.com/office/word/2018/wordml/cex" xmlns:w16cid="http://schemas.microsoft.com/office/word/2016/wordml/cid" xmlns:w16="http://schemas.microsoft.com/office/word/2018/wordml" xmlns:w16du="http://schemas.microsoft.com/office/word/2023/wordml/word16du" xmlns:w16sdtdh="http://schemas.microsoft.com/office/word/2020/wordml/sdtdatahash" xmlns:w16sdtfl="http://schemas.microsoft.com/office/word/2024/wordml/sdtformatlock" xmlns:w16se="http://schemas.microsoft.com/office/word/2015/wordml/symex" xmlns:wpg="http://schemas.microsoft.com/office/word/2010/wordprocessingGroup" xmlns:wpi="http://schemas.microsoft.com/office/word/2010/wordprocessingInk" xmlns:wne="http://schemas.microsoft.com/office/word/2006/wordml" xmlns:wps="http://schemas.microsoft.com/office/word/2010/wordprocessingShape" mc:Ignorable="w14 w15 w16se w16cid w16 w16cex w16sdtdh w16sdtfl w16du wp14">
-  <w:docParts>
-    <w:docPart>
-      <w:docPartPr>
-        <w:name w:val="C7ED24F1327D45379748EBB7AC0BD389"/>
-        <w:category>
-          <w:name w:val="General"/>
-          <w:gallery w:val="placeholder"/>
-        </w:category>
-        <w:types>
-          <w:type w:val="bbPlcHdr"/>
-        </w:types>
-        <w:behaviors>
-          <w:behavior w:val="content"/>
-        </w:behaviors>
-        <w:guid w:val="{81E98DFD-CB29-4ED3-8721-180D33A28778}"/>
-      </w:docPartPr>
-      <w:docPartBody>
-        <w:p>
-          <w:pPr>
-            <w:pStyle w:val="C7ED24F1327D45379748EBB7AC0BD389"/>
-          </w:pPr>
-          <w:r>
-            <w:rPr>
-              <w:caps/>
-              <w:color w:val="156082" w:themeColor="accent1"/>
-              <w:sz w:val="18"/>
-              <w:szCs w:val="18"/>
-            </w:rPr>
-            <w:t>[Document title]</w:t>
-          </w:r>
-        </w:p>
-      </w:docPartBody>
-    </w:docPart>
-    <w:docPart>
-      <w:docPartPr>
-        <w:name w:val="791664737FBA48A58C501B39BDD9B8FA"/>
-        <w:category>
-          <w:name w:val="General"/>
-          <w:gallery w:val="placeholder"/>
-        </w:category>
-        <w:types>
-          <w:type w:val="bbPlcHdr"/>
-        </w:types>
-        <w:behaviors>
-          <w:behavior w:val="content"/>
-        </w:behaviors>
-        <w:guid w:val="{9D8A78A0-EDEF-48AF-9120-32D1E5E7BA22}"/>
-      </w:docPartPr>
-      <w:docPartBody>
-        <w:p>
-          <w:pPr>
-            <w:pStyle w:val="791664737FBA48A58C501B39BDD9B8FA"/>
-          </w:pPr>
-          <w:r>
-            <w:rPr>
-              <w:caps/>
-              <w:color w:val="156082" w:themeColor="accent1"/>
-              <w:sz w:val="18"/>
-              <w:szCs w:val="18"/>
-            </w:rPr>
-            <w:t>[Author name]</w:t>
-          </w:r>
-        </w:p>
-      </w:docPartBody>
-    </w:docPart>
-  </w:docParts>
-</w:glossaryDocument>
-</file>
-
-<file path=word/glossary/fontTable.xml><?xml version="1.0" encoding="utf-8"?>
-<w:fonts xmlns:mc="http://schemas.openxmlformats.org/markup-compatibility/2006" xmlns:r="http://schemas.openxmlformats.org/officeDocument/2006/relationships" xmlns:w="http://schemas.openxmlformats.org/wordprocessingml/2006/main" xmlns:w14="http://schemas.microsoft.com/office/word/2010/wordml" xmlns:w15="http://schemas.microsoft.com/office/word/2012/wordml" xmlns:w16cex="http://schemas.microsoft.com/office/word/2018/wordml/cex" xmlns:w16cid="http://schemas.microsoft.com/office/word/2016/wordml/cid" xmlns:w16="http://schemas.microsoft.com/office/word/2018/wordml" xmlns:w16du="http://schemas.microsoft.com/office/word/2023/wordml/word16du" xmlns:w16sdtdh="http://schemas.microsoft.com/office/word/2020/wordml/sdtdatahash" xmlns:w16sdtfl="http://schemas.microsoft.com/office/word/2024/wordml/sdtformatlock" xmlns:w16se="http://schemas.microsoft.com/office/word/2015/wordml/symex" mc:Ignorable="w14 w15 w16se w16cid w16 w16cex w16sdtdh w16sdtfl w16du">
-  <w:font w:name="Symbol">
-    <w:panose1 w:val="05050102010706020507"/>
-    <w:charset w:val="02"/>
-    <w:family w:val="roman"/>
-    <w:pitch w:val="variable"/>
-    <w:sig w:usb0="00000000" w:usb1="10000000" w:usb2="00000000" w:usb3="00000000" w:csb0="80000000" w:csb1="00000000"/>
-  </w:font>
-  <w:font w:name="Times New Roman">
-    <w:panose1 w:val="02020603050405020304"/>
-    <w:charset w:val="00"/>
-    <w:family w:val="roman"/>
-    <w:pitch w:val="variable"/>
-    <w:sig w:usb0="E0002EFF" w:usb1="C000785B" w:usb2="00000009" w:usb3="00000000" w:csb0="000001FF" w:csb1="00000000"/>
-  </w:font>
-  <w:font w:name="Courier New">
-    <w:panose1 w:val="02070309020205020404"/>
-    <w:charset w:val="00"/>
-    <w:family w:val="modern"/>
-    <w:pitch w:val="fixed"/>
-    <w:sig w:usb0="E0002EFF" w:usb1="C0007843" w:usb2="00000009" w:usb3="00000000" w:csb0="000001FF" w:csb1="00000000"/>
-  </w:font>
-  <w:font w:name="Wingdings">
-    <w:panose1 w:val="05000000000000000000"/>
-    <w:charset w:val="02"/>
-    <w:family w:val="auto"/>
-    <w:pitch w:val="variable"/>
-    <w:sig w:usb0="00000000" w:usb1="10000000" w:usb2="00000000" w:usb3="00000000" w:csb0="80000000" w:csb1="00000000"/>
-  </w:font>
-  <w:font w:name="Aptos">
-    <w:charset w:val="00"/>
-    <w:family w:val="swiss"/>
-    <w:pitch w:val="variable"/>
-    <w:sig w:usb0="20000287" w:usb1="00000003" w:usb2="00000000" w:usb3="00000000" w:csb0="0000019F" w:csb1="00000000"/>
-  </w:font>
-  <w:font w:name="Aptos Display">
-    <w:charset w:val="00"/>
-    <w:family w:val="swiss"/>
-    <w:pitch w:val="variable"/>
-    <w:sig w:usb0="20000287" w:usb1="00000003" w:usb2="00000000" w:usb3="00000000" w:csb0="0000019F" w:csb1="00000000"/>
-  </w:font>
-</w:fonts>
-</file>
-
-<file path=word/glossary/settings.xml><?xml version="1.0" encoding="utf-8"?>
-<w:settings xmlns:mc="http://schemas.openxmlformats.org/markup-compatibility/2006" xmlns:o="urn:schemas-microsoft-com:office:office" xmlns:r="http://schemas.openxmlformats.org/officeDocument/2006/relationships" xmlns:m="http://schemas.openxmlformats.org/officeDocument/2006/math" xmlns:v="urn:schemas-microsoft-com:vml" xmlns:w10="urn:schemas-microsoft-com:office:word" xmlns:w="http://schemas.openxmlformats.org/wordprocessingml/2006/main" xmlns:w14="http://schemas.microsoft.com/office/word/2010/wordml" xmlns:w15="http://schemas.microsoft.com/office/word/2012/wordml" xmlns:w16cex="http://schemas.microsoft.com/office/word/2018/wordml/cex" xmlns:w16cid="http://schemas.microsoft.com/office/word/2016/wordml/cid" xmlns:w16="http://schemas.microsoft.com/office/word/2018/wordml" xmlns:w16du="http://schemas.microsoft.com/office/word/2023/wordml/word16du" xmlns:w16sdtdh="http://schemas.microsoft.com/office/word/2020/wordml/sdtdatahash" xmlns:w16sdtfl="http://schemas.microsoft.com/office/word/2024/wordml/sdtformatlock" xmlns:w16se="http://schemas.microsoft.com/office/word/2015/wordml/symex" xmlns:sl="http://schemas.openxmlformats.org/schemaLibrary/2006/main" mc:Ignorable="w14 w15 w16se w16cid w16 w16cex w16sdtdh w16sdtfl w16du">
-  <w:view w:val="normal"/>
-  <w:defaultTabStop w:val="720"/>
-  <w:characterSpacingControl w:val="doNotCompress"/>
-  <w:compat>
-    <w:useFELayout/>
-    <w:compatSetting w:name="compatibilityMode" w:uri="http://schemas.microsoft.com/office/word" w:val="15"/>
-    <w:compatSetting w:name="overrideTableStyleFontSizeAndJustification" w:uri="http://schemas.microsoft.com/office/word" w:val="1"/>
-    <w:compatSetting w:name="enableOpenTypeFeatures" w:uri="http://schemas.microsoft.com/office/word" w:val="1"/>
-    <w:compatSetting w:name="doNotFlipMirrorIndents" w:uri="http://schemas.microsoft.com/office/word" w:val="1"/>
-    <w:compatSetting w:name="differentiateMultirowTableHeaders" w:uri="http://schemas.microsoft.com/office/word" w:val="1"/>
-    <w:compatSetting w:name="useWord2013TrackBottomHyphenation" w:uri="http://schemas.microsoft.com/office/word" w:val="0"/>
-  </w:compat>
-  <w:rsids>
-    <w:rsidRoot w:val="00D07979"/>
-    <w:rsid w:val="00C466A6"/>
-    <w:rsid w:val="00D07979"/>
-    <w:rsid w:val="00DD4CD6"/>
-  </w:rsids>
-  <m:mathPr>
-    <m:mathFont m:val="Cambria Math"/>
-    <m:brkBin m:val="before"/>
-    <m:brkBinSub m:val="--"/>
-    <m:smallFrac m:val="0"/>
-    <m:dispDef/>
-    <m:lMargin m:val="0"/>
-    <m:rMargin m:val="0"/>
-    <m:defJc m:val="centerGroup"/>
-    <m:wrapIndent m:val="1440"/>
-    <m:intLim m:val="subSup"/>
-    <m:naryLim m:val="undOvr"/>
-  </m:mathPr>
-  <w:themeFontLang w:val="en-US"/>
-  <w:clrSchemeMapping w:bg1="light1" w:t1="dark1" w:bg2="light2" w:t2="dark2" w:accent1="accent1" w:accent2="accent2" w:accent3="accent3" w:accent4="accent4" w:accent5="accent5" w:accent6="accent6" w:hyperlink="hyperlink" w:followedHyperlink="followedHyperlink"/>
-  <w:decimalSymbol w:val=","/>
-  <w:listSeparator w:val=";"/>
-  <w15:chartTrackingRefBased/>
-</w:settings>
-</file>
-
-<file path=word/glossary/styles.xml><?xml version="1.0" encoding="utf-8"?>
-<w:styles xmlns:mc="http://schemas.openxmlformats.org/markup-compatibility/2006" xmlns:r="http://schemas.openxmlformats.org/officeDocument/2006/relationships" xmlns:w="http://schemas.openxmlformats.org/wordprocessingml/2006/main" xmlns:w14="http://schemas.microsoft.com/office/word/2010/wordml" xmlns:w15="http://schemas.microsoft.com/office/word/2012/wordml" xmlns:w16cex="http://schemas.microsoft.com/office/word/2018/wordml/cex" xmlns:w16cid="http://schemas.microsoft.com/office/word/2016/wordml/cid" xmlns:w16="http://schemas.microsoft.com/office/word/2018/wordml" xmlns:w16du="http://schemas.microsoft.com/office/word/2023/wordml/word16du" xmlns:w16sdtdh="http://schemas.microsoft.com/office/word/2020/wordml/sdtdatahash" xmlns:w16sdtfl="http://schemas.microsoft.com/office/word/2024/wordml/sdtformatlock" xmlns:w16se="http://schemas.microsoft.com/office/word/2015/wordml/symex" mc:Ignorable="w14 w15 w16se w16cid w16 w16cex w16sdtdh w16sdtfl w16du">
-  <w:docDefaults>
-    <w:rPrDefault>
-      <w:rPr>
-        <w:rFonts w:asciiTheme="minorHAnsi" w:eastAsiaTheme="minorEastAsia" w:hAnsiTheme="minorHAnsi" w:cstheme="minorBidi"/>
-        <w:kern w:val="2"/>
-        <w:sz w:val="24"/>
-        <w:szCs w:val="24"/>
-        <w:lang w:val="en-US" w:eastAsia="en-US" w:bidi="ar-SA"/>
-        <w14:ligatures w14:val="standardContextual"/>
-      </w:rPr>
-    </w:rPrDefault>
-    <w:pPrDefault>
-      <w:pPr>
-        <w:spacing w:after="160" w:line="278" w:lineRule="auto"/>
-      </w:pPr>
-    </w:pPrDefault>
-  </w:docDefaults>
-  <w:latentStyles w:defLockedState="0" w:defUIPriority="99" w:defSemiHidden="0" w:defUnhideWhenUsed="0" w:defQFormat="0" w:count="376">
-    <w:lsdException w:name="Normal" w:uiPriority="0" w:qFormat="1"/>
-    <w:lsdException w:name="heading 1" w:uiPriority="9" w:qFormat="1"/>
-    <w:lsdException w:name="heading 2" w:semiHidden="1" w:uiPriority="9" w:unhideWhenUsed="1" w:qFormat="1"/>
-    <w:lsdException w:name="heading 3" w:semiHidden="1" w:uiPriority="9" w:unhideWhenUsed="1" w:qFormat="1"/>
-    <w:lsdException w:name="heading 4" w:semiHidden="1" w:uiPriority="9" w:unhideWhenUsed="1" w:qFormat="1"/>
-    <w:lsdException w:name="heading 5" w:semiHidden="1" w:uiPriority="9" w:unhideWhenUsed="1" w:qFormat="1"/>
-    <w:lsdException w:name="heading 6" w:semiHidden="1" w:uiPriority="9" w:unhideWhenUsed="1" w:qFormat="1"/>
-    <w:lsdException w:name="heading 7" w:semiHidden="1" w:uiPriority="9" w:unhideWhenUsed="1" w:qFormat="1"/>
-    <w:lsdException w:name="heading 8" w:semiHidden="1" w:uiPriority="9" w:unhideWhenUsed="1" w:qFormat="1"/>
-    <w:lsdException w:name="heading 9" w:semiHidden="1" w:uiPriority="9" w:unhideWhenUsed="1" w:qFormat="1"/>
-    <w:lsdException w:name="index 1" w:semiHidden="1" w:unhideWhenUsed="1"/>
-    <w:lsdException w:name="index 2" w:semiHidden="1" w:unhideWhenUsed="1"/>
-    <w:lsdException w:name="index 3" w:semiHidden="1" w:unhideWhenUsed="1"/>
-    <w:lsdException w:name="index 4" w:semiHidden="1" w:unhideWhenUsed="1"/>
-    <w:lsdException w:name="index 5" w:semiHidden="1" w:unhideWhenUsed="1"/>
-    <w:lsdException w:name="index 6" w:semiHidden="1" w:unhideWhenUsed="1"/>
-    <w:lsdException w:name="index 7" w:semiHidden="1" w:unhideWhenUsed="1"/>
-    <w:lsdException w:name="index 8" w:semiHidden="1" w:unhideWhenUsed="1"/>
-    <w:lsdException w:name="index 9" w:semiHidden="1" w:unhideWhenUsed="1"/>
-    <w:lsdException w:name="toc 1" w:semiHidden="1" w:uiPriority="39" w:unhideWhenUsed="1"/>
-    <w:lsdException w:name="toc 2" w:semiHidden="1" w:uiPriority="39" w:unhideWhenUsed="1"/>
-    <w:lsdException w:name="toc 3" w:semiHidden="1" w:uiPriority="39" w:unhideWhenUsed="1"/>
-    <w:lsdException w:name="toc 4" w:semiHidden="1" w:uiPriority="39" w:unhideWhenUsed="1"/>
-    <w:lsdException w:name="toc 5" w:semiHidden="1" w:uiPriority="39" w:unhideWhenUsed="1"/>
-    <w:lsdException w:name="toc 6" w:semiHidden="1" w:uiPriority="39" w:unhideWhenUsed="1"/>
-    <w:lsdException w:name="toc 7" w:semiHidden="1" w:uiPriority="39" w:unhideWhenUsed="1"/>
-    <w:lsdException w:name="toc 8" w:semiHidden="1" w:uiPriority="39" w:unhideWhenUsed="1"/>
-    <w:lsdException w:name="toc 9" w:semiHidden="1" w:uiPriority="39" w:unhideWhenUsed="1"/>
-    <w:lsdException w:name="Normal Indent" w:semiHidden="1" w:unhideWhenUsed="1"/>
-    <w:lsdException w:name="footnote text" w:semiHidden="1" w:unhideWhenUsed="1"/>
-    <w:lsdException w:name="annotation text" w:semiHidden="1" w:unhideWhenUsed="1"/>
-    <w:lsdException w:name="header" w:semiHidden="1" w:unhideWhenUsed="1"/>
-    <w:lsdException w:name="footer" w:semiHidden="1" w:unhideWhenUsed="1"/>
-    <w:lsdException w:name="index heading" w:semiHidden="1" w:unhideWhenUsed="1"/>
-    <w:lsdException w:name="caption" w:semiHidden="1" w:uiPriority="35" w:unhideWhenUsed="1" w:qFormat="1"/>
-    <w:lsdException w:name="table of figures" w:semiHidden="1" w:unhideWhenUsed="1"/>
-    <w:lsdException w:name="envelope address" w:semiHidden="1" w:unhideWhenUsed="1"/>
-    <w:lsdException w:name="envelope return" w:semiHidden="1" w:unhideWhenUsed="1"/>
-    <w:lsdException w:name="footnote reference" w:semiHidden="1" w:unhideWhenUsed="1"/>
-    <w:lsdException w:name="annotation reference" w:semiHidden="1" w:unhideWhenUsed="1"/>
-    <w:lsdException w:name="line number" w:semiHidden="1" w:unhideWhenUsed="1"/>
-    <w:lsdException w:name="page number" w:semiHidden="1" w:unhideWhenUsed="1"/>
-    <w:lsdException w:name="endnote reference" w:semiHidden="1" w:unhideWhenUsed="1"/>
-    <w:lsdException w:name="endnote text" w:semiHidden="1" w:unhideWhenUsed="1"/>
-    <w:lsdException w:name="table of authorities" w:semiHidden="1" w:unhideWhenUsed="1"/>
-    <w:lsdException w:name="macro" w:semiHidden="1" w:unhideWhenUsed="1"/>
-    <w:lsdException w:name="toa heading" w:semiHidden="1" w:unhideWhenUsed="1"/>
-    <w:lsdException w:name="List" w:semiHidden="1" w:unhideWhenUsed="1"/>
-    <w:lsdException w:name="List Bullet" w:semiHidden="1" w:unhideWhenUsed="1"/>
-    <w:lsdException w:name="List Number" w:semiHidden="1" w:unhideWhenUsed="1"/>
-    <w:lsdException w:name="List 2" w:semiHidden="1" w:unhideWhenUsed="1"/>
-    <w:lsdException w:name="List 3" w:semiHidden="1" w:unhideWhenUsed="1"/>
-    <w:lsdException w:name="List 4" w:semiHidden="1" w:unhideWhenUsed="1"/>
-    <w:lsdException w:name="List 5" w:semiHidden="1" w:unhideWhenUsed="1"/>
-    <w:lsdException w:name="List Bullet 2" w:semiHidden="1" w:unhideWhenUsed="1"/>
-    <w:lsdException w:name="List Bullet 3" w:semiHidden="1" w:unhideWhenUsed="1"/>
-    <w:lsdException w:name="List Bullet 4" w:semiHidden="1" w:unhideWhenUsed="1"/>
-    <w:lsdException w:name="List Bullet 5" w:semiHidden="1" w:unhideWhenUsed="1"/>
-    <w:lsdException w:name="List Number 2" w:semiHidden="1" w:unhideWhenUsed="1"/>
-    <w:lsdException w:name="List Number 3" w:semiHidden="1" w:unhideWhenUsed="1"/>
-    <w:lsdException w:name="List Number 4" w:semiHidden="1" w:unhideWhenUsed="1"/>
-    <w:lsdException w:name="List Number 5" w:semiHidden="1" w:unhideWhenUsed="1"/>
-    <w:lsdException w:name="Title" w:uiPriority="10" w:qFormat="1"/>
-    <w:lsdException w:name="Closing" w:semiHidden="1" w:unhideWhenUsed="1"/>
-    <w:lsdException w:name="Signature" w:semiHidden="1" w:unhideWhenUsed="1"/>
-    <w:lsdException w:name="Default Paragraph Font" w:semiHidden="1" w:uiPriority="1" w:unhideWhenUsed="1"/>
-    <w:lsdException w:name="Body Text" w:semiHidden="1" w:unhideWhenUsed="1"/>
-    <w:lsdException w:name="Body Text Indent" w:semiHidden="1" w:unhideWhenUsed="1"/>
-    <w:lsdException w:name="List Continue" w:semiHidden="1" w:unhideWhenUsed="1"/>
-    <w:lsdException w:name="List Continue 2" w:semiHidden="1" w:unhideWhenUsed="1"/>
-    <w:lsdException w:name="List Continue 3" w:semiHidden="1" w:unhideWhenUsed="1"/>
-    <w:lsdException w:name="List Continue 4" w:semiHidden="1" w:unhideWhenUsed="1"/>
-    <w:lsdException w:name="List Continue 5" w:semiHidden="1" w:unhideWhenUsed="1"/>
-    <w:lsdException w:name="Message Header" w:semiHidden="1" w:unhideWhenUsed="1"/>
-    <w:lsdException w:name="Subtitle" w:uiPriority="11" w:qFormat="1"/>
-    <w:lsdException w:name="Salutation" w:semiHidden="1" w:unhideWhenUsed="1"/>
-    <w:lsdException w:name="Date" w:semiHidden="1" w:unhideWhenUsed="1"/>
-    <w:lsdException w:name="Body Text First Indent" w:semiHidden="1" w:unhideWhenUsed="1"/>
-    <w:lsdException w:name="Body Text First Indent 2" w:semiHidden="1" w:unhideWhenUsed="1"/>
-    <w:lsdException w:name="Note Heading" w:semiHidden="1" w:unhideWhenUsed="1"/>
-    <w:lsdException w:name="Body Text 2" w:semiHidden="1" w:unhideWhenUsed="1"/>
-    <w:lsdException w:name="Body Text 3" w:semiHidden="1" w:unhideWhenUsed="1"/>
-    <w:lsdException w:name="Body Text Indent 2" w:semiHidden="1" w:unhideWhenUsed="1"/>
-    <w:lsdException w:name="Body Text Indent 3" w:semiHidden="1" w:unhideWhenUsed="1"/>
-    <w:lsdException w:name="Block Text" w:semiHidden="1" w:unhideWhenUsed="1"/>
-    <w:lsdException w:name="Hyperlink" w:semiHidden="1" w:unhideWhenUsed="1"/>
-    <w:lsdException w:name="FollowedHyperlink" w:semiHidden="1" w:unhideWhenUsed="1"/>
-    <w:lsdException w:name="Strong" w:uiPriority="22" w:qFormat="1"/>
-    <w:lsdException w:name="Emphasis" w:uiPriority="20" w:qFormat="1"/>
-    <w:lsdException w:name="Document Map" w:semiHidden="1" w:unhideWhenUsed="1"/>
-    <w:lsdException w:name="Plain Text" w:semiHidden="1" w:unhideWhenUsed="1"/>
-    <w:lsdException w:name="E-mail Signature" w:semiHidden="1" w:unhideWhenUsed="1"/>
-    <w:lsdException w:name="HTML Top of Form" w:semiHidden="1" w:unhideWhenUsed="1"/>
-    <w:lsdException w:name="HTML Bottom of Form" w:semiHidden="1" w:unhideWhenUsed="1"/>
-    <w:lsdException w:name="Normal (Web)" w:semiHidden="1" w:unhideWhenUsed="1"/>
-    <w:lsdException w:name="HTML Acronym" w:semiHidden="1" w:unhideWhenUsed="1"/>
-    <w:lsdException w:name="HTML Address" w:semiHidden="1" w:unhideWhenUsed="1"/>
-    <w:lsdException w:name="HTML Cite" w:semiHidden="1" w:unhideWhenUsed="1"/>
-    <w:lsdException w:name="HTML Code" w:semiHidden="1" w:unhideWhenUsed="1"/>
-    <w:lsdException w:name="HTML Definition" w:semiHidden="1" w:unhideWhenUsed="1"/>
-    <w:lsdException w:name="HTML Keyboard" w:semiHidden="1" w:unhideWhenUsed="1"/>
-    <w:lsdException w:name="HTML Preformatted" w:semiHidden="1" w:unhideWhenUsed="1"/>
-    <w:lsdException w:name="HTML Sample" w:semiHidden="1" w:unhideWhenUsed="1"/>
-    <w:lsdException w:name="HTML Typewriter" w:semiHidden="1" w:unhideWhenUsed="1"/>
-    <w:lsdException w:name="HTML Variable" w:semiHidden="1" w:unhideWhenUsed="1"/>
-    <w:lsdException w:name="Normal Table" w:semiHidden="1" w:unhideWhenUsed="1"/>
-    <w:lsdException w:name="annotation subject" w:semiHidden="1" w:unhideWhenUsed="1"/>
-    <w:lsdException w:name="No List" w:semiHidden="1" w:unhideWhenUsed="1"/>
-    <w:lsdException w:name="Outline List 1" w:semiHidden="1" w:unhideWhenUsed="1"/>
-    <w:lsdException w:name="Outline List 2" w:semiHidden="1" w:unhideWhenUsed="1"/>
-    <w:lsdException w:name="Outline List 3" w:semiHidden="1" w:unhideWhenUsed="1"/>
-    <w:lsdException w:name="Table Simple 1" w:semiHidden="1" w:unhideWhenUsed="1"/>
-    <w:lsdException w:name="Table Simple 2" w:semiHidden="1" w:unhideWhenUsed="1"/>
-    <w:lsdException w:name="Table Simple 3" w:semiHidden="1" w:unhideWhenUsed="1"/>
-    <w:lsdException w:name="Table Classic 1" w:semiHidden="1" w:unhideWhenUsed="1"/>
-    <w:lsdException w:name="Table Classic 2" w:semiHidden="1" w:unhideWhenUsed="1"/>
-    <w:lsdException w:name="Table Classic 3" w:semiHidden="1" w:unhideWhenUsed="1"/>
-    <w:lsdException w:name="Table Classic 4" w:semiHidden="1" w:unhideWhenUsed="1"/>
-    <w:lsdException w:name="Table Colorful 1" w:semiHidden="1" w:unhideWhenUsed="1"/>
-    <w:lsdException w:name="Table Colorful 2" w:semiHidden="1" w:unhideWhenUsed="1"/>
-    <w:lsdException w:name="Table Colorful 3" w:semiHidden="1" w:unhideWhenUsed="1"/>
-    <w:lsdException w:name="Table Columns 1" w:semiHidden="1" w:unhideWhenUsed="1"/>
-    <w:lsdException w:name="Table Columns 2" w:semiHidden="1" w:unhideWhenUsed="1"/>
-    <w:lsdException w:name="Table Columns 3" w:semiHidden="1" w:unhideWhenUsed="1"/>
-    <w:lsdException w:name="Table Columns 4" w:semiHidden="1" w:unhideWhenUsed="1"/>
-    <w:lsdException w:name="Table Columns 5" w:semiHidden="1" w:unhideWhenUsed="1"/>
-    <w:lsdException w:name="Table Grid 1" w:semiHidden="1" w:unhideWhenUsed="1"/>
-    <w:lsdException w:name="Table Grid 2" w:semiHidden="1" w:unhideWhenUsed="1"/>
-    <w:lsdException w:name="Table Grid 3" w:semiHidden="1" w:unhideWhenUsed="1"/>
-    <w:lsdException w:name="Table Grid 4" w:semiHidden="1" w:unhideWhenUsed="1"/>
-    <w:lsdException w:name="Table Grid 5" w:semiHidden="1" w:unhideWhenUsed="1"/>
-    <w:lsdException w:name="Table Grid 6" w:semiHidden="1" w:unhideWhenUsed="1"/>
-    <w:lsdException w:name="Table Grid 7" w:semiHidden="1" w:unhideWhenUsed="1"/>
-    <w:lsdException w:name="Table Grid 8" w:semiHidden="1" w:unhideWhenUsed="1"/>
-    <w:lsdException w:name="Table List 1" w:semiHidden="1" w:unhideWhenUsed="1"/>
-    <w:lsdException w:name="Table List 2" w:semiHidden="1" w:unhideWhenUsed="1"/>
-    <w:lsdException w:name="Table List 3" w:semiHidden="1" w:unhideWhenUsed="1"/>
-    <w:lsdException w:name="Table List 4" w:semiHidden="1" w:unhideWhenUsed="1"/>
-    <w:lsdException w:name="Table List 5" w:semiHidden="1" w:unhideWhenUsed="1"/>
-    <w:lsdException w:name="Table List 6" w:semiHidden="1" w:unhideWhenUsed="1"/>
-    <w:lsdException w:name="Table List 7" w:semiHidden="1" w:unhideWhenUsed="1"/>
-    <w:lsdException w:name="Table List 8" w:semiHidden="1" w:unhideWhenUsed="1"/>
-    <w:lsdException w:name="Table 3D effects 1" w:semiHidden="1" w:unhideWhenUsed="1"/>
-    <w:lsdException w:name="Table 3D effects 2" w:semiHidden="1" w:unhideWhenUsed="1"/>
-    <w:lsdException w:name="Table 3D effects 3" w:semiHidden="1" w:unhideWhenUsed="1"/>
-    <w:lsdException w:name="Table Contemporary" w:semiHidden="1" w:unhideWhenUsed="1"/>
-    <w:lsdException w:name="Table Elegant" w:semiHidden="1" w:unhideWhenUsed="1"/>
-    <w:lsdException w:name="Table Professional" w:semiHidden="1" w:unhideWhenUsed="1"/>
-    <w:lsdException w:name="Table Subtle 1" w:semiHidden="1" w:unhideWhenUsed="1"/>
-    <w:lsdException w:name="Table Subtle 2" w:semiHidden="1" w:unhideWhenUsed="1"/>
-    <w:lsdException w:name="Table Web 1" w:semiHidden="1" w:unhideWhenUsed="1"/>
-    <w:lsdException w:name="Table Web 2" w:semiHidden="1" w:unhideWhenUsed="1"/>
-    <w:lsdException w:name="Table Web 3" w:semiHidden="1" w:unhideWhenUsed="1"/>
-    <w:lsdException w:name="Balloon Text" w:semiHidden="1" w:unhideWhenUsed="1"/>
-    <w:lsdException w:name="Table Grid" w:uiPriority="39"/>
-    <w:lsdException w:name="Table Theme" w:semiHidden="1" w:unhideWhenUsed="1"/>
-    <w:lsdException w:name="Placeholder Text" w:semiHidden="1"/>
-    <w:lsdException w:name="No Spacing" w:uiPriority="1" w:qFormat="1"/>
-    <w:lsdException w:name="Light Shading" w:uiPriority="60"/>
-    <w:lsdException w:name="Light List" w:uiPriority="61"/>
-    <w:lsdException w:name="Light Grid" w:uiPriority="62"/>
-    <w:lsdException w:name="Medium Shading 1" w:uiPriority="63"/>
-    <w:lsdException w:name="Medium Shading 2" w:uiPriority="64"/>
-    <w:lsdException w:name="Medium List 1" w:uiPriority="65"/>
-    <w:lsdException w:name="Medium List 2" w:uiPriority="66"/>
-    <w:lsdException w:name="Medium Grid 1" w:uiPriority="67"/>
-    <w:lsdException w:name="Medium Grid 2" w:uiPriority="68"/>
-    <w:lsdException w:name="Medium Grid 3" w:uiPriority="69"/>
-    <w:lsdException w:name="Dark List" w:uiPriority="70"/>
-    <w:lsdException w:name="Colorful Shading" w:uiPriority="71"/>
-    <w:lsdException w:name="Colorful List" w:uiPriority="72"/>
-    <w:lsdException w:name="Colorful Grid" w:uiPriority="73"/>
-    <w:lsdException w:name="Light Shading Accent 1" w:uiPriority="60"/>
-    <w:lsdException w:name="Light List Accent 1" w:uiPriority="61"/>
-    <w:lsdException w:name="Light Grid Accent 1" w:uiPriority="62"/>
-    <w:lsdException w:name="Medium Shading 1 Accent 1" w:uiPriority="63"/>
-    <w:lsdException w:name="Medium Shading 2 Accent 1" w:uiPriority="64"/>
-    <w:lsdException w:name="Medium List 1 Accent 1" w:uiPriority="65"/>
-    <w:lsdException w:name="Revision" w:semiHidden="1"/>
-    <w:lsdException w:name="List Paragraph" w:uiPriority="34" w:qFormat="1"/>
-    <w:lsdException w:name="Quote" w:uiPriority="29" w:qFormat="1"/>
-    <w:lsdException w:name="Intense Quote" w:uiPriority="30" w:qFormat="1"/>
-    <w:lsdException w:name="Medium List 2 Accent 1" w:uiPriority="66"/>
-    <w:lsdException w:name="Medium Grid 1 Accent 1" w:uiPriority="67"/>
-    <w:lsdException w:name="Medium Grid 2 Accent 1" w:uiPriority="68"/>
-    <w:lsdException w:name="Medium Grid 3 Accent 1" w:uiPriority="69"/>
-    <w:lsdException w:name="Dark List Accent 1" w:uiPriority="70"/>
-    <w:lsdException w:name="Colorful Shading Accent 1" w:uiPriority="71"/>
-    <w:lsdException w:name="Colorful List Accent 1" w:uiPriority="72"/>
-    <w:lsdException w:name="Colorful Grid Accent 1" w:uiPriority="73"/>
-    <w:lsdException w:name="Light Shading Accent 2" w:uiPriority="60"/>
-    <w:lsdException w:name="Light List Accent 2" w:uiPriority="61"/>
-    <w:lsdException w:name="Light Grid Accent 2" w:uiPriority="62"/>
-    <w:lsdException w:name="Medium Shading 1 Accent 2" w:uiPriority="63"/>
-    <w:lsdException w:name="Medium Shading 2 Accent 2" w:uiPriority="64"/>
-    <w:lsdException w:name="Medium List 1 Accent 2" w:uiPriority="65"/>
-    <w:lsdException w:name="Medium List 2 Accent 2" w:uiPriority="66"/>
-    <w:lsdException w:name="Medium Grid 1 Accent 2" w:uiPriority="67"/>
-    <w:lsdException w:name="Medium Grid 2 Accent 2" w:uiPriority="68"/>
-    <w:lsdException w:name="Medium Grid 3 Accent 2" w:uiPriority="69"/>
-    <w:lsdException w:name="Dark List Accent 2" w:uiPriority="70"/>
-    <w:lsdException w:name="Colorful Shading Accent 2" w:uiPriority="71"/>
-    <w:lsdException w:name="Colorful List Accent 2" w:uiPriority="72"/>
-    <w:lsdException w:name="Colorful Grid Accent 2" w:uiPriority="73"/>
-    <w:lsdException w:name="Light Shading Accent 3" w:uiPriority="60"/>
-    <w:lsdException w:name="Light List Accent 3" w:uiPriority="61"/>
-    <w:lsdException w:name="Light Grid Accent 3" w:uiPriority="62"/>
-    <w:lsdException w:name="Medium Shading 1 Accent 3" w:uiPriority="63"/>
-    <w:lsdException w:name="Medium Shading 2 Accent 3" w:uiPriority="64"/>
-    <w:lsdException w:name="Medium List 1 Accent 3" w:uiPriority="65"/>
-    <w:lsdException w:name="Medium List 2 Accent 3" w:uiPriority="66"/>
-    <w:lsdException w:name="Medium Grid 1 Accent 3" w:uiPriority="67"/>
-    <w:lsdException w:name="Medium Grid 2 Accent 3" w:uiPriority="68"/>
-    <w:lsdException w:name="Medium Grid 3 Accent 3" w:uiPriority="69"/>
-    <w:lsdException w:name="Dark List Accent 3" w:uiPriority="70"/>
-    <w:lsdException w:name="Colorful Shading Accent 3" w:uiPriority="71"/>
-    <w:lsdException w:name="Colorful List Accent 3" w:uiPriority="72"/>
-    <w:lsdException w:name="Colorful Grid Accent 3" w:uiPriority="73"/>
-    <w:lsdException w:name="Light Shading Accent 4" w:uiPriority="60"/>
-    <w:lsdException w:name="Light List Accent 4" w:uiPriority="61"/>
-    <w:lsdException w:name="Light Grid Accent 4" w:uiPriority="62"/>
-    <w:lsdException w:name="Medium Shading 1 Accent 4" w:uiPriority="63"/>
-    <w:lsdException w:name="Medium Shading 2 Accent 4" w:uiPriority="64"/>
-    <w:lsdException w:name="Medium List 1 Accent 4" w:uiPriority="65"/>
-    <w:lsdException w:name="Medium List 2 Accent 4" w:uiPriority="66"/>
-    <w:lsdException w:name="Medium Grid 1 Accent 4" w:uiPriority="67"/>
-    <w:lsdException w:name="Medium Grid 2 Accent 4" w:uiPriority="68"/>
-    <w:lsdException w:name="Medium Grid 3 Accent 4" w:uiPriority="69"/>
-    <w:lsdException w:name="Dark List Accent 4" w:uiPriority="70"/>
-    <w:lsdException w:name="Colorful Shading Accent 4" w:uiPriority="71"/>
-    <w:lsdException w:name="Colorful List Accent 4" w:uiPriority="72"/>
-    <w:lsdException w:name="Colorful Grid Accent 4" w:uiPriority="73"/>
-    <w:lsdException w:name="Light Shading Accent 5" w:uiPriority="60"/>
-    <w:lsdException w:name="Light List Accent 5" w:uiPriority="61"/>
-    <w:lsdException w:name="Light Grid Accent 5" w:uiPriority="62"/>
-    <w:lsdException w:name="Medium Shading 1 Accent 5" w:uiPriority="63"/>
-    <w:lsdException w:name="Medium Shading 2 Accent 5" w:uiPriority="64"/>
-    <w:lsdException w:name="Medium List 1 Accent 5" w:uiPriority="65"/>
-    <w:lsdException w:name="Medium List 2 Accent 5" w:uiPriority="66"/>
-    <w:lsdException w:name="Medium Grid 1 Accent 5" w:uiPriority="67"/>
-    <w:lsdException w:name="Medium Grid 2 Accent 5" w:uiPriority="68"/>
-    <w:lsdException w:name="Medium Grid 3 Accent 5" w:uiPriority="69"/>
-    <w:lsdException w:name="Dark List Accent 5" w:uiPriority="70"/>
-    <w:lsdException w:name="Colorful Shading Accent 5" w:uiPriority="71"/>
-    <w:lsdException w:name="Colorful List Accent 5" w:uiPriority="72"/>
-    <w:lsdException w:name="Colorful Grid Accent 5" w:uiPriority="73"/>
-    <w:lsdException w:name="Light Shading Accent 6" w:uiPriority="60"/>
-    <w:lsdException w:name="Light List Accent 6" w:uiPriority="61"/>
-    <w:lsdException w:name="Light Grid Accent 6" w:uiPriority="62"/>
-    <w:lsdException w:name="Medium Shading 1 Accent 6" w:uiPriority="63"/>
-    <w:lsdException w:name="Medium Shading 2 Accent 6" w:uiPriority="64"/>
-    <w:lsdException w:name="Medium List 1 Accent 6" w:uiPriority="65"/>
-    <w:lsdException w:name="Medium List 2 Accent 6" w:uiPriority="66"/>
-    <w:lsdException w:name="Medium Grid 1 Accent 6" w:uiPriority="67"/>
-    <w:lsdException w:name="Medium Grid 2 Accent 6" w:uiPriority="68"/>
-    <w:lsdException w:name="Medium Grid 3 Accent 6" w:uiPriority="69"/>
-    <w:lsdException w:name="Dark List Accent 6" w:uiPriority="70"/>
-    <w:lsdException w:name="Colorful Shading Accent 6" w:uiPriority="71"/>
-    <w:lsdException w:name="Colorful List Accent 6" w:uiPriority="72"/>
-    <w:lsdException w:name="Colorful Grid Accent 6" w:uiPriority="73"/>
-    <w:lsdException w:name="Subtle Emphasis" w:uiPriority="19" w:qFormat="1"/>
-    <w:lsdException w:name="Intense Emphasis" w:uiPriority="21" w:qFormat="1"/>
-    <w:lsdException w:name="Subtle Reference" w:uiPriority="31" w:qFormat="1"/>
-    <w:lsdException w:name="Intense Reference" w:uiPriority="32" w:qFormat="1"/>
-    <w:lsdException w:name="Book Title" w:uiPriority="33" w:qFormat="1"/>
-    <w:lsdException w:name="Bibliography" w:semiHidden="1" w:uiPriority="37" w:unhideWhenUsed="1"/>
-    <w:lsdException w:name="TOC Heading" w:semiHidden="1" w:uiPriority="39" w:unhideWhenUsed="1" w:qFormat="1"/>
-    <w:lsdException w:name="Plain Table 1" w:uiPriority="41"/>
-    <w:lsdException w:name="Plain Table 2" w:uiPriority="42"/>
-    <w:lsdException w:name="Plain Table 3" w:uiPriority="43"/>
-    <w:lsdException w:name="Plain Table 4" w:uiPriority="44"/>
-    <w:lsdException w:name="Plain Table 5" w:uiPriority="45"/>
-    <w:lsdException w:name="Grid Table Light" w:uiPriority="40"/>
-    <w:lsdException w:name="Grid Table 1 Light" w:uiPriority="46"/>
-    <w:lsdException w:name="Grid Table 2" w:uiPriority="47"/>
-    <w:lsdException w:name="Grid Table 3" w:uiPriority="48"/>
-    <w:lsdException w:name="Grid Table 4" w:uiPriority="49"/>
-    <w:lsdException w:name="Grid Table 5 Dark" w:uiPriority="50"/>
-    <w:lsdException w:name="Grid Table 6 Colorful" w:uiPriority="51"/>
-    <w:lsdException w:name="Grid Table 7 Colorful" w:uiPriority="52"/>
-    <w:lsdException w:name="Grid Table 1 Light Accent 1" w:uiPriority="46"/>
-    <w:lsdException w:name="Grid Table 2 Accent 1" w:uiPriority="47"/>
-    <w:lsdException w:name="Grid Table 3 Accent 1" w:uiPriority="48"/>
-    <w:lsdException w:name="Grid Table 4 Accent 1" w:uiPriority="49"/>
-    <w:lsdException w:name="Grid Table 5 Dark Accent 1" w:uiPriority="50"/>
-    <w:lsdException w:name="Grid Table 6 Colorful Accent 1" w:uiPriority="51"/>
-    <w:lsdException w:name="Grid Table 7 Colorful Accent 1" w:uiPriority="52"/>
-    <w:lsdException w:name="Grid Table 1 Light Accent 2" w:uiPriority="46"/>
-    <w:lsdException w:name="Grid Table 2 Accent 2" w:uiPriority="47"/>
-    <w:lsdException w:name="Grid Table 3 Accent 2" w:uiPriority="48"/>
-    <w:lsdException w:name="Grid Table 4 Accent 2" w:uiPriority="49"/>
-    <w:lsdException w:name="Grid Table 5 Dark Accent 2" w:uiPriority="50"/>
-    <w:lsdException w:name="Grid Table 6 Colorful Accent 2" w:uiPriority="51"/>
-    <w:lsdException w:name="Grid Table 7 Colorful Accent 2" w:uiPriority="52"/>
-    <w:lsdException w:name="Grid Table 1 Light Accent 3" w:uiPriority="46"/>
-    <w:lsdException w:name="Grid Table 2 Accent 3" w:uiPriority="47"/>
-    <w:lsdException w:name="Grid Table 3 Accent 3" w:uiPriority="48"/>
-    <w:lsdException w:name="Grid Table 4 Accent 3" w:uiPriority="49"/>
-    <w:lsdException w:name="Grid Table 5 Dark Accent 3" w:uiPriority="50"/>
-    <w:lsdException w:name="Grid Table 6 Colorful Accent 3" w:uiPriority="51"/>
-    <w:lsdException w:name="Grid Table 7 Colorful Accent 3" w:uiPriority="52"/>
-    <w:lsdException w:name="Grid Table 1 Light Accent 4" w:uiPriority="46"/>
-    <w:lsdException w:name="Grid Table 2 Accent 4" w:uiPriority="47"/>
-    <w:lsdException w:name="Grid Table 3 Accent 4" w:uiPriority="48"/>
-    <w:lsdException w:name="Grid Table 4 Accent 4" w:uiPriority="49"/>
-    <w:lsdException w:name="Grid Table 5 Dark Accent 4" w:uiPriority="50"/>
-    <w:lsdException w:name="Grid Table 6 Colorful Accent 4" w:uiPriority="51"/>
-    <w:lsdException w:name="Grid Table 7 Colorful Accent 4" w:uiPriority="52"/>
-    <w:lsdException w:name="Grid Table 1 Light Accent 5" w:uiPriority="46"/>
-    <w:lsdException w:name="Grid Table 2 Accent 5" w:uiPriority="47"/>
-    <w:lsdException w:name="Grid Table 3 Accent 5" w:uiPriority="48"/>
-    <w:lsdException w:name="Grid Table 4 Accent 5" w:uiPriority="49"/>
-    <w:lsdException w:name="Grid Table 5 Dark Accent 5" w:uiPriority="50"/>
-    <w:lsdException w:name="Grid Table 6 Colorful Accent 5" w:uiPriority="51"/>
-    <w:lsdException w:name="Grid Table 7 Colorful Accent 5" w:uiPriority="52"/>
-    <w:lsdException w:name="Grid Table 1 Light Accent 6" w:uiPriority="46"/>
-    <w:lsdException w:name="Grid Table 2 Accent 6" w:uiPriority="47"/>
-    <w:lsdException w:name="Grid Table 3 Accent 6" w:uiPriority="48"/>
-    <w:lsdException w:name="Grid Table 4 Accent 6" w:uiPriority="49"/>
-    <w:lsdException w:name="Grid Table 5 Dark Accent 6" w:uiPriority="50"/>
-    <w:lsdException w:name="Grid Table 6 Colorful Accent 6" w:uiPriority="51"/>
-    <w:lsdException w:name="Grid Table 7 Colorful Accent 6" w:uiPriority="52"/>
-    <w:lsdException w:name="List Table 1 Light" w:uiPriority="46"/>
-    <w:lsdException w:name="List Table 2" w:uiPriority="47"/>
-    <w:lsdException w:name="List Table 3" w:uiPriority="48"/>
-    <w:lsdException w:name="List Table 4" w:uiPriority="49"/>
-    <w:lsdException w:name="List Table 5 Dark" w:uiPriority="50"/>
-    <w:lsdException w:name="List Table 6 Colorful" w:uiPriority="51"/>
-    <w:lsdException w:name="List Table 7 Colorful" w:uiPriority="52"/>
-    <w:lsdException w:name="List Table 1 Light Accent 1" w:uiPriority="46"/>
-    <w:lsdException w:name="List Table 2 Accent 1" w:uiPriority="47"/>
-    <w:lsdException w:name="List Table 3 Accent 1" w:uiPriority="48"/>
-    <w:lsdException w:name="List Table 4 Accent 1" w:uiPriority="49"/>
-    <w:lsdException w:name="List Table 5 Dark Accent 1" w:uiPriority="50"/>
-    <w:lsdException w:name="List Table 6 Colorful Accent 1" w:uiPriority="51"/>
-    <w:lsdException w:name="List Table 7 Colorful Accent 1" w:uiPriority="52"/>
-    <w:lsdException w:name="List Table 1 Light Accent 2" w:uiPriority="46"/>
-    <w:lsdException w:name="List Table 2 Accent 2" w:uiPriority="47"/>
-    <w:lsdException w:name="List Table 3 Accent 2" w:uiPriority="48"/>
-    <w:lsdException w:name="List Table 4 Accent 2" w:uiPriority="49"/>
-    <w:lsdException w:name="List Table 5 Dark Accent 2" w:uiPriority="50"/>
-    <w:lsdException w:name="List Table 6 Colorful Accent 2" w:uiPriority="51"/>
-    <w:lsdException w:name="List Table 7 Colorful Accent 2" w:uiPriority="52"/>
-    <w:lsdException w:name="List Table 1 Light Accent 3" w:uiPriority="46"/>
-    <w:lsdException w:name="List Table 2 Accent 3" w:uiPriority="47"/>
-    <w:lsdException w:name="List Table 3 Accent 3" w:uiPriority="48"/>
-    <w:lsdException w:name="List Table 4 Accent 3" w:uiPriority="49"/>
-    <w:lsdException w:name="List Table 5 Dark Accent 3" w:uiPriority="50"/>
-    <w:lsdException w:name="List Table 6 Colorful Accent 3" w:uiPriority="51"/>
-    <w:lsdException w:name="List Table 7 Colorful Accent 3" w:uiPriority="52"/>
-    <w:lsdException w:name="List Table 1 Light Accent 4" w:uiPriority="46"/>
-    <w:lsdException w:name="List Table 2 Accent 4" w:uiPriority="47"/>
-    <w:lsdException w:name="List Table 3 Accent 4" w:uiPriority="48"/>
-    <w:lsdException w:name="List Table 4 Accent 4" w:uiPriority="49"/>
-    <w:lsdException w:name="List Table 5 Dark Accent 4" w:uiPriority="50"/>
-    <w:lsdException w:name="List Table 6 Colorful Accent 4" w:uiPriority="51"/>
-    <w:lsdException w:name="List Table 7 Colorful Accent 4" w:uiPriority="52"/>
-    <w:lsdException w:name="List Table 1 Light Accent 5" w:uiPriority="46"/>
-    <w:lsdException w:name="List Table 2 Accent 5" w:uiPriority="47"/>
-    <w:lsdException w:name="List Table 3 Accent 5" w:uiPriority="48"/>
-    <w:lsdException w:name="List Table 4 Accent 5" w:uiPriority="49"/>
-    <w:lsdException w:name="List Table 5 Dark Accent 5" w:uiPriority="50"/>
-    <w:lsdException w:name="List Table 6 Colorful Accent 5" w:uiPriority="51"/>
-    <w:lsdException w:name="List Table 7 Colorful Accent 5" w:uiPriority="52"/>
-    <w:lsdException w:name="List Table 1 Light Accent 6" w:uiPriority="46"/>
-    <w:lsdException w:name="List Table 2 Accent 6" w:uiPriority="47"/>
-    <w:lsdException w:name="List Table 3 Accent 6" w:uiPriority="48"/>
-    <w:lsdException w:name="List Table 4 Accent 6" w:uiPriority="49"/>
-    <w:lsdException w:name="List Table 5 Dark Accent 6" w:uiPriority="50"/>
-    <w:lsdException w:name="List Table 6 Colorful Accent 6" w:uiPriority="51"/>
-    <w:lsdException w:name="List Table 7 Colorful Accent 6" w:uiPriority="52"/>
-    <w:lsdException w:name="Mention" w:semiHidden="1" w:unhideWhenUsed="1"/>
-    <w:lsdException w:name="Smart Hyperlink" w:semiHidden="1" w:unhideWhenUsed="1"/>
-    <w:lsdException w:name="Hashtag" w:semiHidden="1" w:unhideWhenUsed="1"/>
-    <w:lsdException w:name="Unresolved Mention" w:semiHidden="1" w:unhideWhenUsed="1"/>
-    <w:lsdException w:name="Smart Link" w:semiHidden="1" w:unhideWhenUsed="1"/>
-  </w:latentStyles>
-  <w:style w:type="paragraph" w:default="1" w:styleId="Normal">
-    <w:name w:val="Normal"/>
-    <w:qFormat/>
-  </w:style>
-  <w:style w:type="character" w:default="1" w:styleId="DefaultParagraphFont">
-    <w:name w:val="Default Paragraph Font"/>
-    <w:uiPriority w:val="1"/>
-    <w:semiHidden/>
-    <w:unhideWhenUsed/>
-  </w:style>
-  <w:style w:type="table" w:default="1" w:styleId="TableNormal">
-    <w:name w:val="Normal Table"/>
-    <w:uiPriority w:val="99"/>
-    <w:semiHidden/>
-    <w:unhideWhenUsed/>
-    <w:tblPr>
-      <w:tblInd w:w="0" w:type="dxa"/>
-      <w:tblCellMar>
-        <w:top w:w="0" w:type="dxa"/>
-        <w:left w:w="108" w:type="dxa"/>
-        <w:bottom w:w="0" w:type="dxa"/>
-        <w:right w:w="108" w:type="dxa"/>
-      </w:tblCellMar>
-    </w:tblPr>
-  </w:style>
-  <w:style w:type="numbering" w:default="1" w:styleId="NoList">
-    <w:name w:val="No List"/>
-    <w:uiPriority w:val="99"/>
-    <w:semiHidden/>
-    <w:unhideWhenUsed/>
-  </w:style>
-  <w:style w:type="paragraph" w:customStyle="1" w:styleId="C7ED24F1327D45379748EBB7AC0BD389">
-    <w:name w:val="C7ED24F1327D45379748EBB7AC0BD389"/>
-    <w:rsid w:val="00D07979"/>
-  </w:style>
-  <w:style w:type="paragraph" w:customStyle="1" w:styleId="791664737FBA48A58C501B39BDD9B8FA">
-    <w:name w:val="791664737FBA48A58C501B39BDD9B8FA"/>
-    <w:rsid w:val="00D07979"/>
-  </w:style>
-</w:styles>
-</file>
-
-<file path=word/glossary/webSettings.xml><?xml version="1.0" encoding="utf-8"?>
-<w:webSettings xmlns:mc="http://schemas.openxmlformats.org/markup-compatibility/2006" xmlns:r="http://schemas.openxmlformats.org/officeDocument/2006/relationships" xmlns:w="http://schemas.openxmlformats.org/wordprocessingml/2006/main" xmlns:w14="http://schemas.microsoft.com/office/word/2010/wordml" xmlns:w15="http://schemas.microsoft.com/office/word/2012/wordml" xmlns:w16cex="http://schemas.microsoft.com/office/word/2018/wordml/cex" xmlns:w16cid="http://schemas.microsoft.com/office/word/2016/wordml/cid" xmlns:w16="http://schemas.microsoft.com/office/word/2018/wordml" xmlns:w16du="http://schemas.microsoft.com/office/word/2023/wordml/word16du" xmlns:w16sdtdh="http://schemas.microsoft.com/office/word/2020/wordml/sdtdatahash" xmlns:w16sdtfl="http://schemas.microsoft.com/office/word/2024/wordml/sdtformatlock" xmlns:w16se="http://schemas.microsoft.com/office/word/2015/wordml/symex" mc:Ignorable="w14 w15 w16se w16cid w16 w16cex w16sdtdh w16sdtfl w16du">
-  <w:optimizeForBrowser/>
-  <w:allowPNG/>
-</w:webSettings>
-</file>
-
 <file path=word/theme/theme1.xml><?xml version="1.0" encoding="utf-8"?>
 <a:theme xmlns:a="http://schemas.openxmlformats.org/drawingml/2006/main" name="Office Theme">
   <a:themeElements>

</xml_diff>